<commit_message>
changement sur le fichier prompt
</commit_message>
<xml_diff>
--- a/Mini_Projet_1_Base_Prompt.docx
+++ b/Mini_Projet_1_Base_Prompt.docx
@@ -7,6 +7,14 @@
         <w:jc w:val="both"/>
       </w:pPr>
       <w:r>
+        <w:t>Prompt :</w:t>
+      </w:r>
+    </w:p>
+    <w:p>
+      <w:pPr>
+        <w:jc w:val="both"/>
+      </w:pPr>
+      <w:r>
         <w:t xml:space="preserve">Tu travailles dans </w:t>
       </w:r>
       <w:r>
@@ -88,54 +96,12 @@
         <w:t xml:space="preserve">comme </w:t>
       </w:r>
       <w:r>
-        <w:rPr>
-          <w:highlight w:val="green"/>
-        </w:rPr>
         <w:t xml:space="preserve">valve corporation. </w:t>
       </w:r>
       <w:r>
-        <w:rPr>
-          <w:highlight w:val="green"/>
-        </w:rPr>
-        <w:t xml:space="preserve">[AJOUTER </w:t>
-      </w:r>
-      <w:r>
-        <w:rPr>
-          <w:highlight w:val="green"/>
-        </w:rPr>
-        <w:t>UNE LISTE DE CE SUR QUOI</w:t>
-      </w:r>
-      <w:r>
-        <w:rPr>
-          <w:highlight w:val="green"/>
-        </w:rPr>
-        <w:t xml:space="preserve"> LES DONNEES ONT ETE COLLECTEES, </w:t>
-      </w:r>
-      <w:r>
-        <w:rPr>
-          <w:highlight w:val="green"/>
-        </w:rPr>
-        <w:t>SANS ETRE TROP</w:t>
-      </w:r>
-      <w:r>
-        <w:rPr>
-          <w:highlight w:val="green"/>
-        </w:rPr>
-        <w:t xml:space="preserve"> PRECIS</w:t>
-      </w:r>
-      <w:r>
-        <w:rPr>
-          <w:highlight w:val="green"/>
-        </w:rPr>
-        <w:t>]</w:t>
-      </w:r>
-      <w:r>
-        <w:t>.</w:t>
-      </w:r>
-      <w:r>
-        <w:t xml:space="preserve"> Inspire-toi </w:t>
-      </w:r>
-      <w:hyperlink r:id="rId4" w:history="1">
+        <w:t xml:space="preserve">Les données ont été collectées sur l'activité des utilisateurs, le catalogue de divertissement, les sessions en ligne et les transactions de la boutique. Inspire-toi du site officiel </w:t>
+      </w:r>
+      <w:hyperlink r:id="rId5" w:tgtFrame="_blank" w:history="1">
         <w:r>
           <w:rPr>
             <w:rStyle w:val="Lienhypertexte"/>
@@ -144,31 +110,55 @@
         </w:r>
       </w:hyperlink>
       <w:r>
+        <w:t xml:space="preserve"> suivant : </w:t>
+      </w:r>
+      <w:r>
+        <w:rPr>
+          <w:i/>
+          <w:iCs/>
+        </w:rPr>
+        <w:t>League of Legends</w:t>
+      </w:r>
+      <w:r>
+        <w:t xml:space="preserve">, </w:t>
+      </w:r>
+      <w:r>
+        <w:rPr>
+          <w:i/>
+          <w:iCs/>
+        </w:rPr>
+        <w:t>VALORANT</w:t>
+      </w:r>
+      <w:r>
+        <w:t xml:space="preserve"> et </w:t>
+      </w:r>
+      <w:proofErr w:type="spellStart"/>
+      <w:r>
+        <w:rPr>
+          <w:i/>
+          <w:iCs/>
+        </w:rPr>
+        <w:t>Teamfight</w:t>
+      </w:r>
+      <w:proofErr w:type="spellEnd"/>
+      <w:r>
+        <w:rPr>
+          <w:i/>
+          <w:iCs/>
+        </w:rPr>
         <w:t xml:space="preserve"> </w:t>
       </w:r>
-      <w:r>
-        <w:t>suivant</w:t>
-      </w:r>
-      <w:r>
-        <w:t xml:space="preserve"> : </w:t>
-      </w:r>
+      <w:proofErr w:type="spellStart"/>
       <w:r>
         <w:rPr>
-          <w:highlight w:val="green"/>
+          <w:i/>
+          <w:iCs/>
         </w:rPr>
-        <w:t>[A COMPLETER</w:t>
-      </w:r>
-      <w:r>
-        <w:rPr>
-          <w:highlight w:val="green"/>
-        </w:rPr>
-        <w:t xml:space="preserve"> AVEC DES REFERENCES</w:t>
-      </w:r>
-      <w:r>
-        <w:rPr>
-          <w:highlight w:val="green"/>
-        </w:rPr>
-        <w:t>].</w:t>
+        <w:t>Tactics</w:t>
+      </w:r>
+      <w:proofErr w:type="spellEnd"/>
+      <w:r>
+        <w:t>.</w:t>
       </w:r>
     </w:p>
     <w:p>
@@ -182,7 +172,7 @@
         <w:rPr>
           <w:highlight w:val="green"/>
         </w:rPr>
-        <w:t>[entreprise/organisation/administration]</w:t>
+        <w:t>entreprise</w:t>
       </w:r>
       <w:r>
         <w:t xml:space="preserve"> </w:t>
@@ -217,10 +207,13 @@
         <w:rPr>
           <w:highlight w:val="green"/>
         </w:rPr>
-        <w:t>[entreprise/organisation/administration]</w:t>
-      </w:r>
-      <w:r>
-        <w:t xml:space="preserve">, sous la forme d'une liste à puce. </w:t>
+        <w:t>entreprise</w:t>
+      </w:r>
+      <w:r>
+        <w:t xml:space="preserve"> </w:t>
+      </w:r>
+      <w:r>
+        <w:t xml:space="preserve">sous la forme d'une liste à puce. </w:t>
       </w:r>
       <w:r>
         <w:t>Elle doit correspondre aux informations que fourni</w:t>
@@ -277,6 +270,3763 @@
       <w:r>
         <w:t xml:space="preserve"> et le dictionnaire de données.</w:t>
       </w:r>
+    </w:p>
+    <w:p>
+      <w:pPr>
+        <w:jc w:val="both"/>
+      </w:pPr>
+    </w:p>
+    <w:p>
+      <w:pPr>
+        <w:jc w:val="both"/>
+      </w:pPr>
+    </w:p>
+    <w:p>
+      <w:pPr>
+        <w:jc w:val="both"/>
+      </w:pPr>
+    </w:p>
+    <w:p>
+      <w:pPr>
+        <w:jc w:val="both"/>
+      </w:pPr>
+    </w:p>
+    <w:p>
+      <w:pPr>
+        <w:jc w:val="both"/>
+      </w:pPr>
+    </w:p>
+    <w:p>
+      <w:pPr>
+        <w:jc w:val="both"/>
+      </w:pPr>
+    </w:p>
+    <w:p>
+      <w:pPr>
+        <w:jc w:val="both"/>
+      </w:pPr>
+    </w:p>
+    <w:p>
+      <w:pPr>
+        <w:jc w:val="both"/>
+      </w:pPr>
+    </w:p>
+    <w:p>
+      <w:pPr>
+        <w:jc w:val="both"/>
+      </w:pPr>
+    </w:p>
+    <w:p>
+      <w:pPr>
+        <w:jc w:val="both"/>
+      </w:pPr>
+    </w:p>
+    <w:p>
+      <w:pPr>
+        <w:jc w:val="both"/>
+      </w:pPr>
+    </w:p>
+    <w:p>
+      <w:pPr>
+        <w:jc w:val="both"/>
+      </w:pPr>
+      <w:proofErr w:type="spellStart"/>
+      <w:r>
+        <w:lastRenderedPageBreak/>
+        <w:t>Rèsultat</w:t>
+      </w:r>
+      <w:proofErr w:type="spellEnd"/>
+      <w:r>
+        <w:t> :</w:t>
+      </w:r>
+    </w:p>
+    <w:p>
+      <w:pPr>
+        <w:jc w:val="both"/>
+        <w:rPr>
+          <w:b/>
+          <w:bCs/>
+        </w:rPr>
+      </w:pPr>
+      <w:r>
+        <w:rPr>
+          <w:b/>
+          <w:bCs/>
+        </w:rPr>
+        <w:t>1. Règles de gestion des données</w:t>
+      </w:r>
+    </w:p>
+    <w:p>
+      <w:pPr>
+        <w:numPr>
+          <w:ilvl w:val="0"/>
+          <w:numId w:val="1"/>
+        </w:numPr>
+        <w:jc w:val="both"/>
+      </w:pPr>
+      <w:r>
+        <w:t xml:space="preserve">Un joueur possède un compte unique identifié par un numéro, un pseudonyme, une adresse </w:t>
+      </w:r>
+      <w:proofErr w:type="gramStart"/>
+      <w:r>
+        <w:t>email</w:t>
+      </w:r>
+      <w:proofErr w:type="gramEnd"/>
+      <w:r>
+        <w:t>, un mot de passe sécurisé (</w:t>
+      </w:r>
+      <w:proofErr w:type="spellStart"/>
+      <w:r>
+        <w:t>hashé</w:t>
+      </w:r>
+      <w:proofErr w:type="spellEnd"/>
+      <w:r>
+        <w:t xml:space="preserve">), une date de création de compte, un pays de résidence, un statut de compte (avec motif et date de suspension le cas échéant) et un rang global. </w:t>
+      </w:r>
+    </w:p>
+    <w:p>
+      <w:pPr>
+        <w:numPr>
+          <w:ilvl w:val="0"/>
+          <w:numId w:val="1"/>
+        </w:numPr>
+        <w:jc w:val="both"/>
+      </w:pPr>
+      <w:r>
+        <w:t xml:space="preserve">L'entreprise développe et gère plusieurs jeux vidéo, caractérisés par un identifiant unique, un nom officiel, un genre, une date de sortie et une plateforme compatible. </w:t>
+      </w:r>
+    </w:p>
+    <w:p>
+      <w:pPr>
+        <w:numPr>
+          <w:ilvl w:val="0"/>
+          <w:numId w:val="1"/>
+        </w:numPr>
+        <w:jc w:val="both"/>
+      </w:pPr>
+      <w:r>
+        <w:t xml:space="preserve">Chaque jeu bénéficie de mises à jour sous forme de patchs, identifiés par un numéro de version et une date de publication, permettant de maintenir le jeu à jour. </w:t>
+      </w:r>
+    </w:p>
+    <w:p>
+      <w:pPr>
+        <w:numPr>
+          <w:ilvl w:val="0"/>
+          <w:numId w:val="1"/>
+        </w:numPr>
+        <w:jc w:val="both"/>
+      </w:pPr>
+      <w:r>
+        <w:t xml:space="preserve">Un jeu contient des personnages jouables (champions ou agents) disposant d'un identifiant, d'un nom, d'un rôle spécifique et d'une date d'ajout dans le jeu. </w:t>
+      </w:r>
+    </w:p>
+    <w:p>
+      <w:pPr>
+        <w:numPr>
+          <w:ilvl w:val="0"/>
+          <w:numId w:val="1"/>
+        </w:numPr>
+        <w:jc w:val="both"/>
+      </w:pPr>
+      <w:r>
+        <w:t xml:space="preserve">Un joueur peut pratiquer et jouer à plusieurs jeux proposés par l'entreprise. </w:t>
+      </w:r>
+    </w:p>
+    <w:p>
+      <w:pPr>
+        <w:numPr>
+          <w:ilvl w:val="0"/>
+          <w:numId w:val="1"/>
+        </w:numPr>
+        <w:jc w:val="both"/>
+      </w:pPr>
+      <w:r>
+        <w:t xml:space="preserve">Les joueurs participent à des parties enregistrées sur les serveurs ; chaque partie possède un identifiant unique, une date, un mode de jeu, une durée, un résultat (victoire ou défaite), un nombre d'éliminations et un score global, et se déroule sur un jeu précis. </w:t>
+      </w:r>
+    </w:p>
+    <w:p>
+      <w:pPr>
+        <w:numPr>
+          <w:ilvl w:val="0"/>
+          <w:numId w:val="1"/>
+        </w:numPr>
+        <w:jc w:val="both"/>
+      </w:pPr>
+      <w:r>
+        <w:t xml:space="preserve">Une partie peut faire l'objet de signalements en cas de comportement inapproprié, enregistrant un identifiant de signalement, un motif et une décision de modération. </w:t>
+      </w:r>
+    </w:p>
+    <w:p>
+      <w:pPr>
+        <w:numPr>
+          <w:ilvl w:val="0"/>
+          <w:numId w:val="1"/>
+        </w:numPr>
+        <w:jc w:val="both"/>
+      </w:pPr>
+      <w:r>
+        <w:t xml:space="preserve">Les joueurs peuvent effectuer des achats dans la boutique du jeu ; chaque transaction est caractérisée par un numéro unique, un montant, une date et un moyen de paiement. </w:t>
+      </w:r>
+    </w:p>
+    <w:p>
+      <w:pPr>
+        <w:jc w:val="both"/>
+        <w:rPr>
+          <w:b/>
+          <w:bCs/>
+        </w:rPr>
+      </w:pPr>
+      <w:r>
+        <w:rPr>
+          <w:b/>
+          <w:bCs/>
+        </w:rPr>
+        <w:t>2. Dictionnaire de données brutes</w:t>
+      </w:r>
+    </w:p>
+    <w:p>
+      <w:pPr>
+        <w:jc w:val="both"/>
+      </w:pPr>
+      <w:r>
+        <w:t xml:space="preserve">Le tableau ci-dessous regroupe l'ensemble des données brutes en correspondance exacte avec les attributs du Modèle Conceptuel de Données (MCD) : </w:t>
+      </w:r>
+    </w:p>
+    <w:tbl>
+      <w:tblPr>
+        <w:tblW w:w="0" w:type="auto"/>
+        <w:tblCellSpacing w:w="15" w:type="dxa"/>
+        <w:tblCellMar>
+          <w:top w:w="15" w:type="dxa"/>
+          <w:left w:w="15" w:type="dxa"/>
+          <w:bottom w:w="15" w:type="dxa"/>
+          <w:right w:w="15" w:type="dxa"/>
+        </w:tblCellMar>
+        <w:tblLook w:val="04A0" w:firstRow="1" w:lastRow="0" w:firstColumn="1" w:lastColumn="0" w:noHBand="0" w:noVBand="1"/>
+      </w:tblPr>
+      <w:tblGrid>
+        <w:gridCol w:w="4681"/>
+        <w:gridCol w:w="2588"/>
+        <w:gridCol w:w="1787"/>
+      </w:tblGrid>
+      <w:tr>
+        <w:trPr>
+          <w:tblHeader/>
+          <w:tblCellSpacing w:w="15" w:type="dxa"/>
+        </w:trPr>
+        <w:tc>
+          <w:tcPr>
+            <w:tcW w:w="0" w:type="auto"/>
+            <w:tcBorders>
+              <w:top w:val="single" w:sz="6" w:space="0" w:color="C4C7C5"/>
+              <w:left w:val="single" w:sz="6" w:space="0" w:color="C4C7C5"/>
+              <w:bottom w:val="single" w:sz="6" w:space="0" w:color="C4C7C5"/>
+              <w:right w:val="single" w:sz="6" w:space="0" w:color="C4C7C5"/>
+            </w:tcBorders>
+            <w:tcMar>
+              <w:top w:w="120" w:type="dxa"/>
+              <w:left w:w="180" w:type="dxa"/>
+              <w:bottom w:w="120" w:type="dxa"/>
+              <w:right w:w="180" w:type="dxa"/>
+            </w:tcMar>
+            <w:vAlign w:val="center"/>
+            <w:hideMark/>
+          </w:tcPr>
+          <w:p>
+            <w:pPr>
+              <w:jc w:val="both"/>
+            </w:pPr>
+            <w:r>
+              <w:rPr>
+                <w:b/>
+                <w:bCs/>
+              </w:rPr>
+              <w:t>Signification de la donnée</w:t>
+            </w:r>
+          </w:p>
+        </w:tc>
+        <w:tc>
+          <w:tcPr>
+            <w:tcW w:w="0" w:type="auto"/>
+            <w:tcBorders>
+              <w:top w:val="single" w:sz="6" w:space="0" w:color="C4C7C5"/>
+              <w:left w:val="single" w:sz="6" w:space="0" w:color="C4C7C5"/>
+              <w:bottom w:val="single" w:sz="6" w:space="0" w:color="C4C7C5"/>
+              <w:right w:val="single" w:sz="6" w:space="0" w:color="C4C7C5"/>
+            </w:tcBorders>
+            <w:tcMar>
+              <w:top w:w="120" w:type="dxa"/>
+              <w:left w:w="180" w:type="dxa"/>
+              <w:bottom w:w="120" w:type="dxa"/>
+              <w:right w:w="180" w:type="dxa"/>
+            </w:tcMar>
+            <w:vAlign w:val="center"/>
+            <w:hideMark/>
+          </w:tcPr>
+          <w:p>
+            <w:pPr>
+              <w:jc w:val="both"/>
+            </w:pPr>
+            <w:r>
+              <w:rPr>
+                <w:b/>
+                <w:bCs/>
+              </w:rPr>
+              <w:t>Type</w:t>
+            </w:r>
+          </w:p>
+        </w:tc>
+        <w:tc>
+          <w:tcPr>
+            <w:tcW w:w="0" w:type="auto"/>
+            <w:tcBorders>
+              <w:top w:val="single" w:sz="6" w:space="0" w:color="C4C7C5"/>
+              <w:left w:val="single" w:sz="6" w:space="0" w:color="C4C7C5"/>
+              <w:bottom w:val="single" w:sz="6" w:space="0" w:color="C4C7C5"/>
+              <w:right w:val="single" w:sz="6" w:space="0" w:color="C4C7C5"/>
+            </w:tcBorders>
+            <w:tcMar>
+              <w:top w:w="120" w:type="dxa"/>
+              <w:left w:w="180" w:type="dxa"/>
+              <w:bottom w:w="120" w:type="dxa"/>
+              <w:right w:w="180" w:type="dxa"/>
+            </w:tcMar>
+            <w:vAlign w:val="center"/>
+            <w:hideMark/>
+          </w:tcPr>
+          <w:p>
+            <w:pPr>
+              <w:jc w:val="both"/>
+            </w:pPr>
+            <w:r>
+              <w:rPr>
+                <w:b/>
+                <w:bCs/>
+              </w:rPr>
+              <w:t>Taille</w:t>
+            </w:r>
+          </w:p>
+        </w:tc>
+      </w:tr>
+      <w:tr>
+        <w:trPr>
+          <w:tblCellSpacing w:w="15" w:type="dxa"/>
+        </w:trPr>
+        <w:tc>
+          <w:tcPr>
+            <w:tcW w:w="0" w:type="auto"/>
+            <w:tcBorders>
+              <w:top w:val="single" w:sz="6" w:space="0" w:color="C4C7C5"/>
+              <w:left w:val="single" w:sz="6" w:space="0" w:color="C4C7C5"/>
+              <w:bottom w:val="single" w:sz="6" w:space="0" w:color="C4C7C5"/>
+              <w:right w:val="single" w:sz="6" w:space="0" w:color="C4C7C5"/>
+            </w:tcBorders>
+            <w:tcMar>
+              <w:top w:w="120" w:type="dxa"/>
+              <w:left w:w="180" w:type="dxa"/>
+              <w:bottom w:w="120" w:type="dxa"/>
+              <w:right w:w="180" w:type="dxa"/>
+            </w:tcMar>
+            <w:vAlign w:val="center"/>
+            <w:hideMark/>
+          </w:tcPr>
+          <w:p>
+            <w:pPr>
+              <w:jc w:val="both"/>
+            </w:pPr>
+            <w:r>
+              <w:t>Identifiant unique du joueur (</w:t>
+            </w:r>
+            <w:proofErr w:type="spellStart"/>
+            <w:r>
+              <w:t>id_joueur</w:t>
+            </w:r>
+            <w:proofErr w:type="spellEnd"/>
+            <w:r>
+              <w:t xml:space="preserve">) </w:t>
+            </w:r>
+          </w:p>
+        </w:tc>
+        <w:tc>
+          <w:tcPr>
+            <w:tcW w:w="0" w:type="auto"/>
+            <w:tcBorders>
+              <w:top w:val="single" w:sz="6" w:space="0" w:color="C4C7C5"/>
+              <w:left w:val="single" w:sz="6" w:space="0" w:color="C4C7C5"/>
+              <w:bottom w:val="single" w:sz="6" w:space="0" w:color="C4C7C5"/>
+              <w:right w:val="single" w:sz="6" w:space="0" w:color="C4C7C5"/>
+            </w:tcBorders>
+            <w:tcMar>
+              <w:top w:w="120" w:type="dxa"/>
+              <w:left w:w="180" w:type="dxa"/>
+              <w:bottom w:w="120" w:type="dxa"/>
+              <w:right w:w="180" w:type="dxa"/>
+            </w:tcMar>
+            <w:vAlign w:val="center"/>
+            <w:hideMark/>
+          </w:tcPr>
+          <w:p>
+            <w:pPr>
+              <w:jc w:val="both"/>
+            </w:pPr>
+            <w:r>
+              <w:t>Numérique / Entier</w:t>
+            </w:r>
+          </w:p>
+        </w:tc>
+        <w:tc>
+          <w:tcPr>
+            <w:tcW w:w="0" w:type="auto"/>
+            <w:tcBorders>
+              <w:top w:val="single" w:sz="6" w:space="0" w:color="C4C7C5"/>
+              <w:left w:val="single" w:sz="6" w:space="0" w:color="C4C7C5"/>
+              <w:bottom w:val="single" w:sz="6" w:space="0" w:color="C4C7C5"/>
+              <w:right w:val="single" w:sz="6" w:space="0" w:color="C4C7C5"/>
+            </w:tcBorders>
+            <w:tcMar>
+              <w:top w:w="120" w:type="dxa"/>
+              <w:left w:w="180" w:type="dxa"/>
+              <w:bottom w:w="120" w:type="dxa"/>
+              <w:right w:w="180" w:type="dxa"/>
+            </w:tcMar>
+            <w:vAlign w:val="center"/>
+            <w:hideMark/>
+          </w:tcPr>
+          <w:p>
+            <w:pPr>
+              <w:jc w:val="both"/>
+            </w:pPr>
+            <w:r>
+              <w:t>8 chiffres</w:t>
+            </w:r>
+          </w:p>
+        </w:tc>
+      </w:tr>
+      <w:tr>
+        <w:trPr>
+          <w:tblCellSpacing w:w="15" w:type="dxa"/>
+        </w:trPr>
+        <w:tc>
+          <w:tcPr>
+            <w:tcW w:w="0" w:type="auto"/>
+            <w:tcBorders>
+              <w:top w:val="single" w:sz="6" w:space="0" w:color="C4C7C5"/>
+              <w:left w:val="single" w:sz="6" w:space="0" w:color="C4C7C5"/>
+              <w:bottom w:val="single" w:sz="6" w:space="0" w:color="C4C7C5"/>
+              <w:right w:val="single" w:sz="6" w:space="0" w:color="C4C7C5"/>
+            </w:tcBorders>
+            <w:tcMar>
+              <w:top w:w="120" w:type="dxa"/>
+              <w:left w:w="180" w:type="dxa"/>
+              <w:bottom w:w="120" w:type="dxa"/>
+              <w:right w:w="180" w:type="dxa"/>
+            </w:tcMar>
+            <w:vAlign w:val="center"/>
+            <w:hideMark/>
+          </w:tcPr>
+          <w:p>
+            <w:pPr>
+              <w:jc w:val="both"/>
+            </w:pPr>
+            <w:r>
+              <w:lastRenderedPageBreak/>
+              <w:t xml:space="preserve">Pseudonyme du joueur (pseudo) </w:t>
+            </w:r>
+          </w:p>
+        </w:tc>
+        <w:tc>
+          <w:tcPr>
+            <w:tcW w:w="0" w:type="auto"/>
+            <w:tcBorders>
+              <w:top w:val="single" w:sz="6" w:space="0" w:color="C4C7C5"/>
+              <w:left w:val="single" w:sz="6" w:space="0" w:color="C4C7C5"/>
+              <w:bottom w:val="single" w:sz="6" w:space="0" w:color="C4C7C5"/>
+              <w:right w:val="single" w:sz="6" w:space="0" w:color="C4C7C5"/>
+            </w:tcBorders>
+            <w:tcMar>
+              <w:top w:w="120" w:type="dxa"/>
+              <w:left w:w="180" w:type="dxa"/>
+              <w:bottom w:w="120" w:type="dxa"/>
+              <w:right w:w="180" w:type="dxa"/>
+            </w:tcMar>
+            <w:vAlign w:val="center"/>
+            <w:hideMark/>
+          </w:tcPr>
+          <w:p>
+            <w:pPr>
+              <w:jc w:val="both"/>
+            </w:pPr>
+            <w:r>
+              <w:t>Alphabétique / Chaîne</w:t>
+            </w:r>
+          </w:p>
+        </w:tc>
+        <w:tc>
+          <w:tcPr>
+            <w:tcW w:w="0" w:type="auto"/>
+            <w:tcBorders>
+              <w:top w:val="single" w:sz="6" w:space="0" w:color="C4C7C5"/>
+              <w:left w:val="single" w:sz="6" w:space="0" w:color="C4C7C5"/>
+              <w:bottom w:val="single" w:sz="6" w:space="0" w:color="C4C7C5"/>
+              <w:right w:val="single" w:sz="6" w:space="0" w:color="C4C7C5"/>
+            </w:tcBorders>
+            <w:tcMar>
+              <w:top w:w="120" w:type="dxa"/>
+              <w:left w:w="180" w:type="dxa"/>
+              <w:bottom w:w="120" w:type="dxa"/>
+              <w:right w:w="180" w:type="dxa"/>
+            </w:tcMar>
+            <w:vAlign w:val="center"/>
+            <w:hideMark/>
+          </w:tcPr>
+          <w:p>
+            <w:pPr>
+              <w:jc w:val="both"/>
+            </w:pPr>
+            <w:r>
+              <w:t>32 caractères</w:t>
+            </w:r>
+          </w:p>
+        </w:tc>
+      </w:tr>
+      <w:tr>
+        <w:trPr>
+          <w:tblCellSpacing w:w="15" w:type="dxa"/>
+        </w:trPr>
+        <w:tc>
+          <w:tcPr>
+            <w:tcW w:w="0" w:type="auto"/>
+            <w:tcBorders>
+              <w:top w:val="single" w:sz="6" w:space="0" w:color="C4C7C5"/>
+              <w:left w:val="single" w:sz="6" w:space="0" w:color="C4C7C5"/>
+              <w:bottom w:val="single" w:sz="6" w:space="0" w:color="C4C7C5"/>
+              <w:right w:val="single" w:sz="6" w:space="0" w:color="C4C7C5"/>
+            </w:tcBorders>
+            <w:tcMar>
+              <w:top w:w="120" w:type="dxa"/>
+              <w:left w:w="180" w:type="dxa"/>
+              <w:bottom w:w="120" w:type="dxa"/>
+              <w:right w:w="180" w:type="dxa"/>
+            </w:tcMar>
+            <w:vAlign w:val="center"/>
+            <w:hideMark/>
+          </w:tcPr>
+          <w:p>
+            <w:pPr>
+              <w:jc w:val="both"/>
+            </w:pPr>
+            <w:r>
+              <w:t xml:space="preserve">Adresse </w:t>
+            </w:r>
+            <w:proofErr w:type="gramStart"/>
+            <w:r>
+              <w:t>email</w:t>
+            </w:r>
+            <w:proofErr w:type="gramEnd"/>
+            <w:r>
+              <w:t xml:space="preserve"> du joueur (email) </w:t>
+            </w:r>
+          </w:p>
+        </w:tc>
+        <w:tc>
+          <w:tcPr>
+            <w:tcW w:w="0" w:type="auto"/>
+            <w:tcBorders>
+              <w:top w:val="single" w:sz="6" w:space="0" w:color="C4C7C5"/>
+              <w:left w:val="single" w:sz="6" w:space="0" w:color="C4C7C5"/>
+              <w:bottom w:val="single" w:sz="6" w:space="0" w:color="C4C7C5"/>
+              <w:right w:val="single" w:sz="6" w:space="0" w:color="C4C7C5"/>
+            </w:tcBorders>
+            <w:tcMar>
+              <w:top w:w="120" w:type="dxa"/>
+              <w:left w:w="180" w:type="dxa"/>
+              <w:bottom w:w="120" w:type="dxa"/>
+              <w:right w:w="180" w:type="dxa"/>
+            </w:tcMar>
+            <w:vAlign w:val="center"/>
+            <w:hideMark/>
+          </w:tcPr>
+          <w:p>
+            <w:pPr>
+              <w:jc w:val="both"/>
+            </w:pPr>
+            <w:proofErr w:type="spellStart"/>
+            <w:r>
+              <w:t>Alpha-numérique</w:t>
+            </w:r>
+            <w:proofErr w:type="spellEnd"/>
+            <w:r>
+              <w:t xml:space="preserve"> / Chaîne</w:t>
+            </w:r>
+          </w:p>
+        </w:tc>
+        <w:tc>
+          <w:tcPr>
+            <w:tcW w:w="0" w:type="auto"/>
+            <w:tcBorders>
+              <w:top w:val="single" w:sz="6" w:space="0" w:color="C4C7C5"/>
+              <w:left w:val="single" w:sz="6" w:space="0" w:color="C4C7C5"/>
+              <w:bottom w:val="single" w:sz="6" w:space="0" w:color="C4C7C5"/>
+              <w:right w:val="single" w:sz="6" w:space="0" w:color="C4C7C5"/>
+            </w:tcBorders>
+            <w:tcMar>
+              <w:top w:w="120" w:type="dxa"/>
+              <w:left w:w="180" w:type="dxa"/>
+              <w:bottom w:w="120" w:type="dxa"/>
+              <w:right w:w="180" w:type="dxa"/>
+            </w:tcMar>
+            <w:vAlign w:val="center"/>
+            <w:hideMark/>
+          </w:tcPr>
+          <w:p>
+            <w:pPr>
+              <w:jc w:val="both"/>
+            </w:pPr>
+            <w:r>
+              <w:t>100 caractères</w:t>
+            </w:r>
+          </w:p>
+        </w:tc>
+      </w:tr>
+      <w:tr>
+        <w:trPr>
+          <w:tblCellSpacing w:w="15" w:type="dxa"/>
+        </w:trPr>
+        <w:tc>
+          <w:tcPr>
+            <w:tcW w:w="0" w:type="auto"/>
+            <w:tcBorders>
+              <w:top w:val="single" w:sz="6" w:space="0" w:color="C4C7C5"/>
+              <w:left w:val="single" w:sz="6" w:space="0" w:color="C4C7C5"/>
+              <w:bottom w:val="single" w:sz="6" w:space="0" w:color="C4C7C5"/>
+              <w:right w:val="single" w:sz="6" w:space="0" w:color="C4C7C5"/>
+            </w:tcBorders>
+            <w:tcMar>
+              <w:top w:w="120" w:type="dxa"/>
+              <w:left w:w="180" w:type="dxa"/>
+              <w:bottom w:w="120" w:type="dxa"/>
+              <w:right w:w="180" w:type="dxa"/>
+            </w:tcMar>
+            <w:vAlign w:val="center"/>
+            <w:hideMark/>
+          </w:tcPr>
+          <w:p>
+            <w:pPr>
+              <w:jc w:val="both"/>
+            </w:pPr>
+            <w:r>
+              <w:t xml:space="preserve">Mot de passe </w:t>
+            </w:r>
+            <w:proofErr w:type="spellStart"/>
+            <w:r>
+              <w:t>hashé</w:t>
+            </w:r>
+            <w:proofErr w:type="spellEnd"/>
+            <w:r>
+              <w:t xml:space="preserve"> du joueur (</w:t>
+            </w:r>
+            <w:proofErr w:type="spellStart"/>
+            <w:r>
+              <w:t>mot_de_passe_hash</w:t>
+            </w:r>
+            <w:proofErr w:type="spellEnd"/>
+            <w:r>
+              <w:t xml:space="preserve">) </w:t>
+            </w:r>
+          </w:p>
+        </w:tc>
+        <w:tc>
+          <w:tcPr>
+            <w:tcW w:w="0" w:type="auto"/>
+            <w:tcBorders>
+              <w:top w:val="single" w:sz="6" w:space="0" w:color="C4C7C5"/>
+              <w:left w:val="single" w:sz="6" w:space="0" w:color="C4C7C5"/>
+              <w:bottom w:val="single" w:sz="6" w:space="0" w:color="C4C7C5"/>
+              <w:right w:val="single" w:sz="6" w:space="0" w:color="C4C7C5"/>
+            </w:tcBorders>
+            <w:tcMar>
+              <w:top w:w="120" w:type="dxa"/>
+              <w:left w:w="180" w:type="dxa"/>
+              <w:bottom w:w="120" w:type="dxa"/>
+              <w:right w:w="180" w:type="dxa"/>
+            </w:tcMar>
+            <w:vAlign w:val="center"/>
+            <w:hideMark/>
+          </w:tcPr>
+          <w:p>
+            <w:pPr>
+              <w:jc w:val="both"/>
+            </w:pPr>
+            <w:proofErr w:type="spellStart"/>
+            <w:r>
+              <w:t>Alpha-numérique</w:t>
+            </w:r>
+            <w:proofErr w:type="spellEnd"/>
+            <w:r>
+              <w:t xml:space="preserve"> / Chaîne</w:t>
+            </w:r>
+          </w:p>
+        </w:tc>
+        <w:tc>
+          <w:tcPr>
+            <w:tcW w:w="0" w:type="auto"/>
+            <w:tcBorders>
+              <w:top w:val="single" w:sz="6" w:space="0" w:color="C4C7C5"/>
+              <w:left w:val="single" w:sz="6" w:space="0" w:color="C4C7C5"/>
+              <w:bottom w:val="single" w:sz="6" w:space="0" w:color="C4C7C5"/>
+              <w:right w:val="single" w:sz="6" w:space="0" w:color="C4C7C5"/>
+            </w:tcBorders>
+            <w:tcMar>
+              <w:top w:w="120" w:type="dxa"/>
+              <w:left w:w="180" w:type="dxa"/>
+              <w:bottom w:w="120" w:type="dxa"/>
+              <w:right w:w="180" w:type="dxa"/>
+            </w:tcMar>
+            <w:vAlign w:val="center"/>
+            <w:hideMark/>
+          </w:tcPr>
+          <w:p>
+            <w:pPr>
+              <w:jc w:val="both"/>
+            </w:pPr>
+            <w:r>
+              <w:t>64 caractères</w:t>
+            </w:r>
+          </w:p>
+        </w:tc>
+      </w:tr>
+      <w:tr>
+        <w:trPr>
+          <w:tblCellSpacing w:w="15" w:type="dxa"/>
+        </w:trPr>
+        <w:tc>
+          <w:tcPr>
+            <w:tcW w:w="0" w:type="auto"/>
+            <w:tcBorders>
+              <w:top w:val="single" w:sz="6" w:space="0" w:color="C4C7C5"/>
+              <w:left w:val="single" w:sz="6" w:space="0" w:color="C4C7C5"/>
+              <w:bottom w:val="single" w:sz="6" w:space="0" w:color="C4C7C5"/>
+              <w:right w:val="single" w:sz="6" w:space="0" w:color="C4C7C5"/>
+            </w:tcBorders>
+            <w:tcMar>
+              <w:top w:w="120" w:type="dxa"/>
+              <w:left w:w="180" w:type="dxa"/>
+              <w:bottom w:w="120" w:type="dxa"/>
+              <w:right w:w="180" w:type="dxa"/>
+            </w:tcMar>
+            <w:vAlign w:val="center"/>
+            <w:hideMark/>
+          </w:tcPr>
+          <w:p>
+            <w:pPr>
+              <w:jc w:val="both"/>
+            </w:pPr>
+            <w:r>
+              <w:t>Date de création du compte (</w:t>
+            </w:r>
+            <w:proofErr w:type="spellStart"/>
+            <w:r>
+              <w:t>date_creation_compte</w:t>
+            </w:r>
+            <w:proofErr w:type="spellEnd"/>
+            <w:r>
+              <w:t xml:space="preserve">) </w:t>
+            </w:r>
+          </w:p>
+        </w:tc>
+        <w:tc>
+          <w:tcPr>
+            <w:tcW w:w="0" w:type="auto"/>
+            <w:tcBorders>
+              <w:top w:val="single" w:sz="6" w:space="0" w:color="C4C7C5"/>
+              <w:left w:val="single" w:sz="6" w:space="0" w:color="C4C7C5"/>
+              <w:bottom w:val="single" w:sz="6" w:space="0" w:color="C4C7C5"/>
+              <w:right w:val="single" w:sz="6" w:space="0" w:color="C4C7C5"/>
+            </w:tcBorders>
+            <w:tcMar>
+              <w:top w:w="120" w:type="dxa"/>
+              <w:left w:w="180" w:type="dxa"/>
+              <w:bottom w:w="120" w:type="dxa"/>
+              <w:right w:w="180" w:type="dxa"/>
+            </w:tcMar>
+            <w:vAlign w:val="center"/>
+            <w:hideMark/>
+          </w:tcPr>
+          <w:p>
+            <w:pPr>
+              <w:jc w:val="both"/>
+            </w:pPr>
+            <w:r>
+              <w:t>Date</w:t>
+            </w:r>
+          </w:p>
+        </w:tc>
+        <w:tc>
+          <w:tcPr>
+            <w:tcW w:w="0" w:type="auto"/>
+            <w:tcBorders>
+              <w:top w:val="single" w:sz="6" w:space="0" w:color="C4C7C5"/>
+              <w:left w:val="single" w:sz="6" w:space="0" w:color="C4C7C5"/>
+              <w:bottom w:val="single" w:sz="6" w:space="0" w:color="C4C7C5"/>
+              <w:right w:val="single" w:sz="6" w:space="0" w:color="C4C7C5"/>
+            </w:tcBorders>
+            <w:tcMar>
+              <w:top w:w="120" w:type="dxa"/>
+              <w:left w:w="180" w:type="dxa"/>
+              <w:bottom w:w="120" w:type="dxa"/>
+              <w:right w:w="180" w:type="dxa"/>
+            </w:tcMar>
+            <w:vAlign w:val="center"/>
+            <w:hideMark/>
+          </w:tcPr>
+          <w:p>
+            <w:pPr>
+              <w:jc w:val="both"/>
+            </w:pPr>
+            <w:r>
+              <w:t>10 caractères</w:t>
+            </w:r>
+          </w:p>
+        </w:tc>
+      </w:tr>
+      <w:tr>
+        <w:trPr>
+          <w:tblCellSpacing w:w="15" w:type="dxa"/>
+        </w:trPr>
+        <w:tc>
+          <w:tcPr>
+            <w:tcW w:w="0" w:type="auto"/>
+            <w:tcBorders>
+              <w:top w:val="single" w:sz="6" w:space="0" w:color="C4C7C5"/>
+              <w:left w:val="single" w:sz="6" w:space="0" w:color="C4C7C5"/>
+              <w:bottom w:val="single" w:sz="6" w:space="0" w:color="C4C7C5"/>
+              <w:right w:val="single" w:sz="6" w:space="0" w:color="C4C7C5"/>
+            </w:tcBorders>
+            <w:tcMar>
+              <w:top w:w="120" w:type="dxa"/>
+              <w:left w:w="180" w:type="dxa"/>
+              <w:bottom w:w="120" w:type="dxa"/>
+              <w:right w:w="180" w:type="dxa"/>
+            </w:tcMar>
+            <w:vAlign w:val="center"/>
+            <w:hideMark/>
+          </w:tcPr>
+          <w:p>
+            <w:pPr>
+              <w:jc w:val="both"/>
+            </w:pPr>
+            <w:r>
+              <w:t>Pays de résidence du joueur (</w:t>
+            </w:r>
+            <w:proofErr w:type="spellStart"/>
+            <w:r>
+              <w:t>pays_residence</w:t>
+            </w:r>
+            <w:proofErr w:type="spellEnd"/>
+            <w:r>
+              <w:t xml:space="preserve">) </w:t>
+            </w:r>
+          </w:p>
+        </w:tc>
+        <w:tc>
+          <w:tcPr>
+            <w:tcW w:w="0" w:type="auto"/>
+            <w:tcBorders>
+              <w:top w:val="single" w:sz="6" w:space="0" w:color="C4C7C5"/>
+              <w:left w:val="single" w:sz="6" w:space="0" w:color="C4C7C5"/>
+              <w:bottom w:val="single" w:sz="6" w:space="0" w:color="C4C7C5"/>
+              <w:right w:val="single" w:sz="6" w:space="0" w:color="C4C7C5"/>
+            </w:tcBorders>
+            <w:tcMar>
+              <w:top w:w="120" w:type="dxa"/>
+              <w:left w:w="180" w:type="dxa"/>
+              <w:bottom w:w="120" w:type="dxa"/>
+              <w:right w:w="180" w:type="dxa"/>
+            </w:tcMar>
+            <w:vAlign w:val="center"/>
+            <w:hideMark/>
+          </w:tcPr>
+          <w:p>
+            <w:pPr>
+              <w:jc w:val="both"/>
+            </w:pPr>
+            <w:r>
+              <w:t>Alphabétique / Chaîne</w:t>
+            </w:r>
+          </w:p>
+        </w:tc>
+        <w:tc>
+          <w:tcPr>
+            <w:tcW w:w="0" w:type="auto"/>
+            <w:tcBorders>
+              <w:top w:val="single" w:sz="6" w:space="0" w:color="C4C7C5"/>
+              <w:left w:val="single" w:sz="6" w:space="0" w:color="C4C7C5"/>
+              <w:bottom w:val="single" w:sz="6" w:space="0" w:color="C4C7C5"/>
+              <w:right w:val="single" w:sz="6" w:space="0" w:color="C4C7C5"/>
+            </w:tcBorders>
+            <w:tcMar>
+              <w:top w:w="120" w:type="dxa"/>
+              <w:left w:w="180" w:type="dxa"/>
+              <w:bottom w:w="120" w:type="dxa"/>
+              <w:right w:w="180" w:type="dxa"/>
+            </w:tcMar>
+            <w:vAlign w:val="center"/>
+            <w:hideMark/>
+          </w:tcPr>
+          <w:p>
+            <w:pPr>
+              <w:jc w:val="both"/>
+            </w:pPr>
+            <w:r>
+              <w:t>50 caractères</w:t>
+            </w:r>
+          </w:p>
+        </w:tc>
+      </w:tr>
+      <w:tr>
+        <w:trPr>
+          <w:tblCellSpacing w:w="15" w:type="dxa"/>
+        </w:trPr>
+        <w:tc>
+          <w:tcPr>
+            <w:tcW w:w="0" w:type="auto"/>
+            <w:tcBorders>
+              <w:top w:val="single" w:sz="6" w:space="0" w:color="C4C7C5"/>
+              <w:left w:val="single" w:sz="6" w:space="0" w:color="C4C7C5"/>
+              <w:bottom w:val="single" w:sz="6" w:space="0" w:color="C4C7C5"/>
+              <w:right w:val="single" w:sz="6" w:space="0" w:color="C4C7C5"/>
+            </w:tcBorders>
+            <w:tcMar>
+              <w:top w:w="120" w:type="dxa"/>
+              <w:left w:w="180" w:type="dxa"/>
+              <w:bottom w:w="120" w:type="dxa"/>
+              <w:right w:w="180" w:type="dxa"/>
+            </w:tcMar>
+            <w:vAlign w:val="center"/>
+            <w:hideMark/>
+          </w:tcPr>
+          <w:p>
+            <w:pPr>
+              <w:jc w:val="both"/>
+            </w:pPr>
+            <w:r>
+              <w:t>Statut du compte du joueur (</w:t>
+            </w:r>
+            <w:proofErr w:type="spellStart"/>
+            <w:r>
+              <w:t>statut_compte</w:t>
+            </w:r>
+            <w:proofErr w:type="spellEnd"/>
+            <w:r>
+              <w:t xml:space="preserve">) </w:t>
+            </w:r>
+          </w:p>
+        </w:tc>
+        <w:tc>
+          <w:tcPr>
+            <w:tcW w:w="0" w:type="auto"/>
+            <w:tcBorders>
+              <w:top w:val="single" w:sz="6" w:space="0" w:color="C4C7C5"/>
+              <w:left w:val="single" w:sz="6" w:space="0" w:color="C4C7C5"/>
+              <w:bottom w:val="single" w:sz="6" w:space="0" w:color="C4C7C5"/>
+              <w:right w:val="single" w:sz="6" w:space="0" w:color="C4C7C5"/>
+            </w:tcBorders>
+            <w:tcMar>
+              <w:top w:w="120" w:type="dxa"/>
+              <w:left w:w="180" w:type="dxa"/>
+              <w:bottom w:w="120" w:type="dxa"/>
+              <w:right w:w="180" w:type="dxa"/>
+            </w:tcMar>
+            <w:vAlign w:val="center"/>
+            <w:hideMark/>
+          </w:tcPr>
+          <w:p>
+            <w:pPr>
+              <w:jc w:val="both"/>
+            </w:pPr>
+            <w:r>
+              <w:t>Alphabétique / Chaîne</w:t>
+            </w:r>
+          </w:p>
+        </w:tc>
+        <w:tc>
+          <w:tcPr>
+            <w:tcW w:w="0" w:type="auto"/>
+            <w:tcBorders>
+              <w:top w:val="single" w:sz="6" w:space="0" w:color="C4C7C5"/>
+              <w:left w:val="single" w:sz="6" w:space="0" w:color="C4C7C5"/>
+              <w:bottom w:val="single" w:sz="6" w:space="0" w:color="C4C7C5"/>
+              <w:right w:val="single" w:sz="6" w:space="0" w:color="C4C7C5"/>
+            </w:tcBorders>
+            <w:tcMar>
+              <w:top w:w="120" w:type="dxa"/>
+              <w:left w:w="180" w:type="dxa"/>
+              <w:bottom w:w="120" w:type="dxa"/>
+              <w:right w:w="180" w:type="dxa"/>
+            </w:tcMar>
+            <w:vAlign w:val="center"/>
+            <w:hideMark/>
+          </w:tcPr>
+          <w:p>
+            <w:pPr>
+              <w:jc w:val="both"/>
+            </w:pPr>
+            <w:r>
+              <w:t>15 caractères</w:t>
+            </w:r>
+          </w:p>
+        </w:tc>
+      </w:tr>
+      <w:tr>
+        <w:trPr>
+          <w:tblCellSpacing w:w="15" w:type="dxa"/>
+        </w:trPr>
+        <w:tc>
+          <w:tcPr>
+            <w:tcW w:w="0" w:type="auto"/>
+            <w:tcBorders>
+              <w:top w:val="single" w:sz="6" w:space="0" w:color="C4C7C5"/>
+              <w:left w:val="single" w:sz="6" w:space="0" w:color="C4C7C5"/>
+              <w:bottom w:val="single" w:sz="6" w:space="0" w:color="C4C7C5"/>
+              <w:right w:val="single" w:sz="6" w:space="0" w:color="C4C7C5"/>
+            </w:tcBorders>
+            <w:tcMar>
+              <w:top w:w="120" w:type="dxa"/>
+              <w:left w:w="180" w:type="dxa"/>
+              <w:bottom w:w="120" w:type="dxa"/>
+              <w:right w:w="180" w:type="dxa"/>
+            </w:tcMar>
+            <w:vAlign w:val="center"/>
+            <w:hideMark/>
+          </w:tcPr>
+          <w:p>
+            <w:pPr>
+              <w:jc w:val="both"/>
+            </w:pPr>
+            <w:r>
+              <w:t>Motif de suspension du compte (</w:t>
+            </w:r>
+            <w:proofErr w:type="spellStart"/>
+            <w:r>
+              <w:t>motif_suspension</w:t>
+            </w:r>
+            <w:proofErr w:type="spellEnd"/>
+            <w:r>
+              <w:t xml:space="preserve">) </w:t>
+            </w:r>
+          </w:p>
+        </w:tc>
+        <w:tc>
+          <w:tcPr>
+            <w:tcW w:w="0" w:type="auto"/>
+            <w:tcBorders>
+              <w:top w:val="single" w:sz="6" w:space="0" w:color="C4C7C5"/>
+              <w:left w:val="single" w:sz="6" w:space="0" w:color="C4C7C5"/>
+              <w:bottom w:val="single" w:sz="6" w:space="0" w:color="C4C7C5"/>
+              <w:right w:val="single" w:sz="6" w:space="0" w:color="C4C7C5"/>
+            </w:tcBorders>
+            <w:tcMar>
+              <w:top w:w="120" w:type="dxa"/>
+              <w:left w:w="180" w:type="dxa"/>
+              <w:bottom w:w="120" w:type="dxa"/>
+              <w:right w:w="180" w:type="dxa"/>
+            </w:tcMar>
+            <w:vAlign w:val="center"/>
+            <w:hideMark/>
+          </w:tcPr>
+          <w:p>
+            <w:pPr>
+              <w:jc w:val="both"/>
+            </w:pPr>
+            <w:proofErr w:type="spellStart"/>
+            <w:r>
+              <w:t>Alpha-numérique</w:t>
+            </w:r>
+            <w:proofErr w:type="spellEnd"/>
+            <w:r>
+              <w:t xml:space="preserve"> / Chaîne</w:t>
+            </w:r>
+          </w:p>
+        </w:tc>
+        <w:tc>
+          <w:tcPr>
+            <w:tcW w:w="0" w:type="auto"/>
+            <w:tcBorders>
+              <w:top w:val="single" w:sz="6" w:space="0" w:color="C4C7C5"/>
+              <w:left w:val="single" w:sz="6" w:space="0" w:color="C4C7C5"/>
+              <w:bottom w:val="single" w:sz="6" w:space="0" w:color="C4C7C5"/>
+              <w:right w:val="single" w:sz="6" w:space="0" w:color="C4C7C5"/>
+            </w:tcBorders>
+            <w:tcMar>
+              <w:top w:w="120" w:type="dxa"/>
+              <w:left w:w="180" w:type="dxa"/>
+              <w:bottom w:w="120" w:type="dxa"/>
+              <w:right w:w="180" w:type="dxa"/>
+            </w:tcMar>
+            <w:vAlign w:val="center"/>
+            <w:hideMark/>
+          </w:tcPr>
+          <w:p>
+            <w:pPr>
+              <w:jc w:val="both"/>
+            </w:pPr>
+            <w:r>
+              <w:t>255 caractères</w:t>
+            </w:r>
+          </w:p>
+        </w:tc>
+      </w:tr>
+      <w:tr>
+        <w:trPr>
+          <w:tblCellSpacing w:w="15" w:type="dxa"/>
+        </w:trPr>
+        <w:tc>
+          <w:tcPr>
+            <w:tcW w:w="0" w:type="auto"/>
+            <w:tcBorders>
+              <w:top w:val="single" w:sz="6" w:space="0" w:color="C4C7C5"/>
+              <w:left w:val="single" w:sz="6" w:space="0" w:color="C4C7C5"/>
+              <w:bottom w:val="single" w:sz="6" w:space="0" w:color="C4C7C5"/>
+              <w:right w:val="single" w:sz="6" w:space="0" w:color="C4C7C5"/>
+            </w:tcBorders>
+            <w:tcMar>
+              <w:top w:w="120" w:type="dxa"/>
+              <w:left w:w="180" w:type="dxa"/>
+              <w:bottom w:w="120" w:type="dxa"/>
+              <w:right w:w="180" w:type="dxa"/>
+            </w:tcMar>
+            <w:vAlign w:val="center"/>
+            <w:hideMark/>
+          </w:tcPr>
+          <w:p>
+            <w:pPr>
+              <w:jc w:val="both"/>
+            </w:pPr>
+            <w:r>
+              <w:t>Date de suspension du compte (</w:t>
+            </w:r>
+            <w:proofErr w:type="spellStart"/>
+            <w:r>
+              <w:t>date_suspension</w:t>
+            </w:r>
+            <w:proofErr w:type="spellEnd"/>
+            <w:r>
+              <w:t xml:space="preserve">) </w:t>
+            </w:r>
+          </w:p>
+        </w:tc>
+        <w:tc>
+          <w:tcPr>
+            <w:tcW w:w="0" w:type="auto"/>
+            <w:tcBorders>
+              <w:top w:val="single" w:sz="6" w:space="0" w:color="C4C7C5"/>
+              <w:left w:val="single" w:sz="6" w:space="0" w:color="C4C7C5"/>
+              <w:bottom w:val="single" w:sz="6" w:space="0" w:color="C4C7C5"/>
+              <w:right w:val="single" w:sz="6" w:space="0" w:color="C4C7C5"/>
+            </w:tcBorders>
+            <w:tcMar>
+              <w:top w:w="120" w:type="dxa"/>
+              <w:left w:w="180" w:type="dxa"/>
+              <w:bottom w:w="120" w:type="dxa"/>
+              <w:right w:w="180" w:type="dxa"/>
+            </w:tcMar>
+            <w:vAlign w:val="center"/>
+            <w:hideMark/>
+          </w:tcPr>
+          <w:p>
+            <w:pPr>
+              <w:jc w:val="both"/>
+            </w:pPr>
+            <w:r>
+              <w:t>Date</w:t>
+            </w:r>
+          </w:p>
+        </w:tc>
+        <w:tc>
+          <w:tcPr>
+            <w:tcW w:w="0" w:type="auto"/>
+            <w:tcBorders>
+              <w:top w:val="single" w:sz="6" w:space="0" w:color="C4C7C5"/>
+              <w:left w:val="single" w:sz="6" w:space="0" w:color="C4C7C5"/>
+              <w:bottom w:val="single" w:sz="6" w:space="0" w:color="C4C7C5"/>
+              <w:right w:val="single" w:sz="6" w:space="0" w:color="C4C7C5"/>
+            </w:tcBorders>
+            <w:tcMar>
+              <w:top w:w="120" w:type="dxa"/>
+              <w:left w:w="180" w:type="dxa"/>
+              <w:bottom w:w="120" w:type="dxa"/>
+              <w:right w:w="180" w:type="dxa"/>
+            </w:tcMar>
+            <w:vAlign w:val="center"/>
+            <w:hideMark/>
+          </w:tcPr>
+          <w:p>
+            <w:pPr>
+              <w:jc w:val="both"/>
+            </w:pPr>
+            <w:r>
+              <w:t>10 caractères</w:t>
+            </w:r>
+          </w:p>
+        </w:tc>
+      </w:tr>
+      <w:tr>
+        <w:trPr>
+          <w:tblCellSpacing w:w="15" w:type="dxa"/>
+        </w:trPr>
+        <w:tc>
+          <w:tcPr>
+            <w:tcW w:w="0" w:type="auto"/>
+            <w:tcBorders>
+              <w:top w:val="single" w:sz="6" w:space="0" w:color="C4C7C5"/>
+              <w:left w:val="single" w:sz="6" w:space="0" w:color="C4C7C5"/>
+              <w:bottom w:val="single" w:sz="6" w:space="0" w:color="C4C7C5"/>
+              <w:right w:val="single" w:sz="6" w:space="0" w:color="C4C7C5"/>
+            </w:tcBorders>
+            <w:tcMar>
+              <w:top w:w="120" w:type="dxa"/>
+              <w:left w:w="180" w:type="dxa"/>
+              <w:bottom w:w="120" w:type="dxa"/>
+              <w:right w:w="180" w:type="dxa"/>
+            </w:tcMar>
+            <w:vAlign w:val="center"/>
+            <w:hideMark/>
+          </w:tcPr>
+          <w:p>
+            <w:pPr>
+              <w:jc w:val="both"/>
+            </w:pPr>
+            <w:r>
+              <w:t>Rang du joueur (</w:t>
+            </w:r>
+            <w:proofErr w:type="spellStart"/>
+            <w:r>
+              <w:t>rang_joueur</w:t>
+            </w:r>
+            <w:proofErr w:type="spellEnd"/>
+            <w:r>
+              <w:t xml:space="preserve">) </w:t>
+            </w:r>
+          </w:p>
+        </w:tc>
+        <w:tc>
+          <w:tcPr>
+            <w:tcW w:w="0" w:type="auto"/>
+            <w:tcBorders>
+              <w:top w:val="single" w:sz="6" w:space="0" w:color="C4C7C5"/>
+              <w:left w:val="single" w:sz="6" w:space="0" w:color="C4C7C5"/>
+              <w:bottom w:val="single" w:sz="6" w:space="0" w:color="C4C7C5"/>
+              <w:right w:val="single" w:sz="6" w:space="0" w:color="C4C7C5"/>
+            </w:tcBorders>
+            <w:tcMar>
+              <w:top w:w="120" w:type="dxa"/>
+              <w:left w:w="180" w:type="dxa"/>
+              <w:bottom w:w="120" w:type="dxa"/>
+              <w:right w:w="180" w:type="dxa"/>
+            </w:tcMar>
+            <w:vAlign w:val="center"/>
+            <w:hideMark/>
+          </w:tcPr>
+          <w:p>
+            <w:pPr>
+              <w:jc w:val="both"/>
+            </w:pPr>
+            <w:proofErr w:type="spellStart"/>
+            <w:r>
+              <w:t>Alpha-numérique</w:t>
+            </w:r>
+            <w:proofErr w:type="spellEnd"/>
+            <w:r>
+              <w:t xml:space="preserve"> / Chaîne</w:t>
+            </w:r>
+          </w:p>
+        </w:tc>
+        <w:tc>
+          <w:tcPr>
+            <w:tcW w:w="0" w:type="auto"/>
+            <w:tcBorders>
+              <w:top w:val="single" w:sz="6" w:space="0" w:color="C4C7C5"/>
+              <w:left w:val="single" w:sz="6" w:space="0" w:color="C4C7C5"/>
+              <w:bottom w:val="single" w:sz="6" w:space="0" w:color="C4C7C5"/>
+              <w:right w:val="single" w:sz="6" w:space="0" w:color="C4C7C5"/>
+            </w:tcBorders>
+            <w:tcMar>
+              <w:top w:w="120" w:type="dxa"/>
+              <w:left w:w="180" w:type="dxa"/>
+              <w:bottom w:w="120" w:type="dxa"/>
+              <w:right w:w="180" w:type="dxa"/>
+            </w:tcMar>
+            <w:vAlign w:val="center"/>
+            <w:hideMark/>
+          </w:tcPr>
+          <w:p>
+            <w:pPr>
+              <w:jc w:val="both"/>
+            </w:pPr>
+            <w:r>
+              <w:t>20 caractères</w:t>
+            </w:r>
+          </w:p>
+        </w:tc>
+      </w:tr>
+      <w:tr>
+        <w:trPr>
+          <w:tblCellSpacing w:w="15" w:type="dxa"/>
+        </w:trPr>
+        <w:tc>
+          <w:tcPr>
+            <w:tcW w:w="0" w:type="auto"/>
+            <w:tcBorders>
+              <w:top w:val="single" w:sz="6" w:space="0" w:color="C4C7C5"/>
+              <w:left w:val="single" w:sz="6" w:space="0" w:color="C4C7C5"/>
+              <w:bottom w:val="single" w:sz="6" w:space="0" w:color="C4C7C5"/>
+              <w:right w:val="single" w:sz="6" w:space="0" w:color="C4C7C5"/>
+            </w:tcBorders>
+            <w:tcMar>
+              <w:top w:w="120" w:type="dxa"/>
+              <w:left w:w="180" w:type="dxa"/>
+              <w:bottom w:w="120" w:type="dxa"/>
+              <w:right w:w="180" w:type="dxa"/>
+            </w:tcMar>
+            <w:vAlign w:val="center"/>
+            <w:hideMark/>
+          </w:tcPr>
+          <w:p>
+            <w:pPr>
+              <w:jc w:val="both"/>
+            </w:pPr>
+            <w:r>
+              <w:t>Identifiant unique du jeu (</w:t>
+            </w:r>
+            <w:proofErr w:type="spellStart"/>
+            <w:r>
+              <w:t>id_jeu</w:t>
+            </w:r>
+            <w:proofErr w:type="spellEnd"/>
+            <w:r>
+              <w:t xml:space="preserve">) </w:t>
+            </w:r>
+          </w:p>
+        </w:tc>
+        <w:tc>
+          <w:tcPr>
+            <w:tcW w:w="0" w:type="auto"/>
+            <w:tcBorders>
+              <w:top w:val="single" w:sz="6" w:space="0" w:color="C4C7C5"/>
+              <w:left w:val="single" w:sz="6" w:space="0" w:color="C4C7C5"/>
+              <w:bottom w:val="single" w:sz="6" w:space="0" w:color="C4C7C5"/>
+              <w:right w:val="single" w:sz="6" w:space="0" w:color="C4C7C5"/>
+            </w:tcBorders>
+            <w:tcMar>
+              <w:top w:w="120" w:type="dxa"/>
+              <w:left w:w="180" w:type="dxa"/>
+              <w:bottom w:w="120" w:type="dxa"/>
+              <w:right w:w="180" w:type="dxa"/>
+            </w:tcMar>
+            <w:vAlign w:val="center"/>
+            <w:hideMark/>
+          </w:tcPr>
+          <w:p>
+            <w:pPr>
+              <w:jc w:val="both"/>
+            </w:pPr>
+            <w:r>
+              <w:t>Numérique / Entier</w:t>
+            </w:r>
+          </w:p>
+        </w:tc>
+        <w:tc>
+          <w:tcPr>
+            <w:tcW w:w="0" w:type="auto"/>
+            <w:tcBorders>
+              <w:top w:val="single" w:sz="6" w:space="0" w:color="C4C7C5"/>
+              <w:left w:val="single" w:sz="6" w:space="0" w:color="C4C7C5"/>
+              <w:bottom w:val="single" w:sz="6" w:space="0" w:color="C4C7C5"/>
+              <w:right w:val="single" w:sz="6" w:space="0" w:color="C4C7C5"/>
+            </w:tcBorders>
+            <w:tcMar>
+              <w:top w:w="120" w:type="dxa"/>
+              <w:left w:w="180" w:type="dxa"/>
+              <w:bottom w:w="120" w:type="dxa"/>
+              <w:right w:w="180" w:type="dxa"/>
+            </w:tcMar>
+            <w:vAlign w:val="center"/>
+            <w:hideMark/>
+          </w:tcPr>
+          <w:p>
+            <w:pPr>
+              <w:jc w:val="both"/>
+            </w:pPr>
+            <w:r>
+              <w:t>4 chiffres</w:t>
+            </w:r>
+          </w:p>
+        </w:tc>
+      </w:tr>
+      <w:tr>
+        <w:trPr>
+          <w:tblCellSpacing w:w="15" w:type="dxa"/>
+        </w:trPr>
+        <w:tc>
+          <w:tcPr>
+            <w:tcW w:w="0" w:type="auto"/>
+            <w:tcBorders>
+              <w:top w:val="single" w:sz="6" w:space="0" w:color="C4C7C5"/>
+              <w:left w:val="single" w:sz="6" w:space="0" w:color="C4C7C5"/>
+              <w:bottom w:val="single" w:sz="6" w:space="0" w:color="C4C7C5"/>
+              <w:right w:val="single" w:sz="6" w:space="0" w:color="C4C7C5"/>
+            </w:tcBorders>
+            <w:tcMar>
+              <w:top w:w="120" w:type="dxa"/>
+              <w:left w:w="180" w:type="dxa"/>
+              <w:bottom w:w="120" w:type="dxa"/>
+              <w:right w:w="180" w:type="dxa"/>
+            </w:tcMar>
+            <w:vAlign w:val="center"/>
+            <w:hideMark/>
+          </w:tcPr>
+          <w:p>
+            <w:pPr>
+              <w:jc w:val="both"/>
+            </w:pPr>
+            <w:r>
+              <w:t>Nom du jeu vidéo (</w:t>
+            </w:r>
+            <w:proofErr w:type="spellStart"/>
+            <w:r>
+              <w:t>nom_jeu</w:t>
+            </w:r>
+            <w:proofErr w:type="spellEnd"/>
+            <w:r>
+              <w:t xml:space="preserve">) </w:t>
+            </w:r>
+          </w:p>
+        </w:tc>
+        <w:tc>
+          <w:tcPr>
+            <w:tcW w:w="0" w:type="auto"/>
+            <w:tcBorders>
+              <w:top w:val="single" w:sz="6" w:space="0" w:color="C4C7C5"/>
+              <w:left w:val="single" w:sz="6" w:space="0" w:color="C4C7C5"/>
+              <w:bottom w:val="single" w:sz="6" w:space="0" w:color="C4C7C5"/>
+              <w:right w:val="single" w:sz="6" w:space="0" w:color="C4C7C5"/>
+            </w:tcBorders>
+            <w:tcMar>
+              <w:top w:w="120" w:type="dxa"/>
+              <w:left w:w="180" w:type="dxa"/>
+              <w:bottom w:w="120" w:type="dxa"/>
+              <w:right w:w="180" w:type="dxa"/>
+            </w:tcMar>
+            <w:vAlign w:val="center"/>
+            <w:hideMark/>
+          </w:tcPr>
+          <w:p>
+            <w:pPr>
+              <w:jc w:val="both"/>
+            </w:pPr>
+            <w:r>
+              <w:t>Alphabétique / Chaîne</w:t>
+            </w:r>
+          </w:p>
+        </w:tc>
+        <w:tc>
+          <w:tcPr>
+            <w:tcW w:w="0" w:type="auto"/>
+            <w:tcBorders>
+              <w:top w:val="single" w:sz="6" w:space="0" w:color="C4C7C5"/>
+              <w:left w:val="single" w:sz="6" w:space="0" w:color="C4C7C5"/>
+              <w:bottom w:val="single" w:sz="6" w:space="0" w:color="C4C7C5"/>
+              <w:right w:val="single" w:sz="6" w:space="0" w:color="C4C7C5"/>
+            </w:tcBorders>
+            <w:tcMar>
+              <w:top w:w="120" w:type="dxa"/>
+              <w:left w:w="180" w:type="dxa"/>
+              <w:bottom w:w="120" w:type="dxa"/>
+              <w:right w:w="180" w:type="dxa"/>
+            </w:tcMar>
+            <w:vAlign w:val="center"/>
+            <w:hideMark/>
+          </w:tcPr>
+          <w:p>
+            <w:pPr>
+              <w:jc w:val="both"/>
+            </w:pPr>
+            <w:r>
+              <w:t>40 caractères</w:t>
+            </w:r>
+          </w:p>
+        </w:tc>
+      </w:tr>
+      <w:tr>
+        <w:trPr>
+          <w:tblCellSpacing w:w="15" w:type="dxa"/>
+        </w:trPr>
+        <w:tc>
+          <w:tcPr>
+            <w:tcW w:w="0" w:type="auto"/>
+            <w:tcBorders>
+              <w:top w:val="single" w:sz="6" w:space="0" w:color="C4C7C5"/>
+              <w:left w:val="single" w:sz="6" w:space="0" w:color="C4C7C5"/>
+              <w:bottom w:val="single" w:sz="6" w:space="0" w:color="C4C7C5"/>
+              <w:right w:val="single" w:sz="6" w:space="0" w:color="C4C7C5"/>
+            </w:tcBorders>
+            <w:tcMar>
+              <w:top w:w="120" w:type="dxa"/>
+              <w:left w:w="180" w:type="dxa"/>
+              <w:bottom w:w="120" w:type="dxa"/>
+              <w:right w:w="180" w:type="dxa"/>
+            </w:tcMar>
+            <w:vAlign w:val="center"/>
+            <w:hideMark/>
+          </w:tcPr>
+          <w:p>
+            <w:pPr>
+              <w:jc w:val="both"/>
+            </w:pPr>
+            <w:r>
+              <w:lastRenderedPageBreak/>
+              <w:t>Genre du jeu vidéo (</w:t>
+            </w:r>
+            <w:proofErr w:type="spellStart"/>
+            <w:r>
+              <w:t>genre_jeu</w:t>
+            </w:r>
+            <w:proofErr w:type="spellEnd"/>
+            <w:r>
+              <w:t xml:space="preserve">) </w:t>
+            </w:r>
+          </w:p>
+        </w:tc>
+        <w:tc>
+          <w:tcPr>
+            <w:tcW w:w="0" w:type="auto"/>
+            <w:tcBorders>
+              <w:top w:val="single" w:sz="6" w:space="0" w:color="C4C7C5"/>
+              <w:left w:val="single" w:sz="6" w:space="0" w:color="C4C7C5"/>
+              <w:bottom w:val="single" w:sz="6" w:space="0" w:color="C4C7C5"/>
+              <w:right w:val="single" w:sz="6" w:space="0" w:color="C4C7C5"/>
+            </w:tcBorders>
+            <w:tcMar>
+              <w:top w:w="120" w:type="dxa"/>
+              <w:left w:w="180" w:type="dxa"/>
+              <w:bottom w:w="120" w:type="dxa"/>
+              <w:right w:w="180" w:type="dxa"/>
+            </w:tcMar>
+            <w:vAlign w:val="center"/>
+            <w:hideMark/>
+          </w:tcPr>
+          <w:p>
+            <w:pPr>
+              <w:jc w:val="both"/>
+            </w:pPr>
+            <w:r>
+              <w:t>Alphabétique / Chaîne</w:t>
+            </w:r>
+          </w:p>
+        </w:tc>
+        <w:tc>
+          <w:tcPr>
+            <w:tcW w:w="0" w:type="auto"/>
+            <w:tcBorders>
+              <w:top w:val="single" w:sz="6" w:space="0" w:color="C4C7C5"/>
+              <w:left w:val="single" w:sz="6" w:space="0" w:color="C4C7C5"/>
+              <w:bottom w:val="single" w:sz="6" w:space="0" w:color="C4C7C5"/>
+              <w:right w:val="single" w:sz="6" w:space="0" w:color="C4C7C5"/>
+            </w:tcBorders>
+            <w:tcMar>
+              <w:top w:w="120" w:type="dxa"/>
+              <w:left w:w="180" w:type="dxa"/>
+              <w:bottom w:w="120" w:type="dxa"/>
+              <w:right w:w="180" w:type="dxa"/>
+            </w:tcMar>
+            <w:vAlign w:val="center"/>
+            <w:hideMark/>
+          </w:tcPr>
+          <w:p>
+            <w:pPr>
+              <w:jc w:val="both"/>
+            </w:pPr>
+            <w:r>
+              <w:t>20 caractères</w:t>
+            </w:r>
+          </w:p>
+        </w:tc>
+      </w:tr>
+      <w:tr>
+        <w:trPr>
+          <w:tblCellSpacing w:w="15" w:type="dxa"/>
+        </w:trPr>
+        <w:tc>
+          <w:tcPr>
+            <w:tcW w:w="0" w:type="auto"/>
+            <w:tcBorders>
+              <w:top w:val="single" w:sz="6" w:space="0" w:color="C4C7C5"/>
+              <w:left w:val="single" w:sz="6" w:space="0" w:color="C4C7C5"/>
+              <w:bottom w:val="single" w:sz="6" w:space="0" w:color="C4C7C5"/>
+              <w:right w:val="single" w:sz="6" w:space="0" w:color="C4C7C5"/>
+            </w:tcBorders>
+            <w:tcMar>
+              <w:top w:w="120" w:type="dxa"/>
+              <w:left w:w="180" w:type="dxa"/>
+              <w:bottom w:w="120" w:type="dxa"/>
+              <w:right w:w="180" w:type="dxa"/>
+            </w:tcMar>
+            <w:vAlign w:val="center"/>
+            <w:hideMark/>
+          </w:tcPr>
+          <w:p>
+            <w:pPr>
+              <w:jc w:val="both"/>
+            </w:pPr>
+            <w:r>
+              <w:t>Date de sortie officielle du jeu (</w:t>
+            </w:r>
+            <w:proofErr w:type="spellStart"/>
+            <w:r>
+              <w:t>date_sortie_jeu</w:t>
+            </w:r>
+            <w:proofErr w:type="spellEnd"/>
+            <w:r>
+              <w:t xml:space="preserve">) </w:t>
+            </w:r>
+          </w:p>
+        </w:tc>
+        <w:tc>
+          <w:tcPr>
+            <w:tcW w:w="0" w:type="auto"/>
+            <w:tcBorders>
+              <w:top w:val="single" w:sz="6" w:space="0" w:color="C4C7C5"/>
+              <w:left w:val="single" w:sz="6" w:space="0" w:color="C4C7C5"/>
+              <w:bottom w:val="single" w:sz="6" w:space="0" w:color="C4C7C5"/>
+              <w:right w:val="single" w:sz="6" w:space="0" w:color="C4C7C5"/>
+            </w:tcBorders>
+            <w:tcMar>
+              <w:top w:w="120" w:type="dxa"/>
+              <w:left w:w="180" w:type="dxa"/>
+              <w:bottom w:w="120" w:type="dxa"/>
+              <w:right w:w="180" w:type="dxa"/>
+            </w:tcMar>
+            <w:vAlign w:val="center"/>
+            <w:hideMark/>
+          </w:tcPr>
+          <w:p>
+            <w:pPr>
+              <w:jc w:val="both"/>
+            </w:pPr>
+            <w:r>
+              <w:t>Date</w:t>
+            </w:r>
+          </w:p>
+        </w:tc>
+        <w:tc>
+          <w:tcPr>
+            <w:tcW w:w="0" w:type="auto"/>
+            <w:tcBorders>
+              <w:top w:val="single" w:sz="6" w:space="0" w:color="C4C7C5"/>
+              <w:left w:val="single" w:sz="6" w:space="0" w:color="C4C7C5"/>
+              <w:bottom w:val="single" w:sz="6" w:space="0" w:color="C4C7C5"/>
+              <w:right w:val="single" w:sz="6" w:space="0" w:color="C4C7C5"/>
+            </w:tcBorders>
+            <w:tcMar>
+              <w:top w:w="120" w:type="dxa"/>
+              <w:left w:w="180" w:type="dxa"/>
+              <w:bottom w:w="120" w:type="dxa"/>
+              <w:right w:w="180" w:type="dxa"/>
+            </w:tcMar>
+            <w:vAlign w:val="center"/>
+            <w:hideMark/>
+          </w:tcPr>
+          <w:p>
+            <w:pPr>
+              <w:jc w:val="both"/>
+            </w:pPr>
+            <w:r>
+              <w:t>10 caractères</w:t>
+            </w:r>
+          </w:p>
+        </w:tc>
+      </w:tr>
+      <w:tr>
+        <w:trPr>
+          <w:tblCellSpacing w:w="15" w:type="dxa"/>
+        </w:trPr>
+        <w:tc>
+          <w:tcPr>
+            <w:tcW w:w="0" w:type="auto"/>
+            <w:tcBorders>
+              <w:top w:val="single" w:sz="6" w:space="0" w:color="C4C7C5"/>
+              <w:left w:val="single" w:sz="6" w:space="0" w:color="C4C7C5"/>
+              <w:bottom w:val="single" w:sz="6" w:space="0" w:color="C4C7C5"/>
+              <w:right w:val="single" w:sz="6" w:space="0" w:color="C4C7C5"/>
+            </w:tcBorders>
+            <w:tcMar>
+              <w:top w:w="120" w:type="dxa"/>
+              <w:left w:w="180" w:type="dxa"/>
+              <w:bottom w:w="120" w:type="dxa"/>
+              <w:right w:w="180" w:type="dxa"/>
+            </w:tcMar>
+            <w:vAlign w:val="center"/>
+            <w:hideMark/>
+          </w:tcPr>
+          <w:p>
+            <w:pPr>
+              <w:jc w:val="both"/>
+            </w:pPr>
+            <w:r>
+              <w:t xml:space="preserve">Plateforme du jeu (plateforme) </w:t>
+            </w:r>
+          </w:p>
+        </w:tc>
+        <w:tc>
+          <w:tcPr>
+            <w:tcW w:w="0" w:type="auto"/>
+            <w:tcBorders>
+              <w:top w:val="single" w:sz="6" w:space="0" w:color="C4C7C5"/>
+              <w:left w:val="single" w:sz="6" w:space="0" w:color="C4C7C5"/>
+              <w:bottom w:val="single" w:sz="6" w:space="0" w:color="C4C7C5"/>
+              <w:right w:val="single" w:sz="6" w:space="0" w:color="C4C7C5"/>
+            </w:tcBorders>
+            <w:tcMar>
+              <w:top w:w="120" w:type="dxa"/>
+              <w:left w:w="180" w:type="dxa"/>
+              <w:bottom w:w="120" w:type="dxa"/>
+              <w:right w:w="180" w:type="dxa"/>
+            </w:tcMar>
+            <w:vAlign w:val="center"/>
+            <w:hideMark/>
+          </w:tcPr>
+          <w:p>
+            <w:pPr>
+              <w:jc w:val="both"/>
+            </w:pPr>
+            <w:r>
+              <w:t>Alphabétique / Chaîne</w:t>
+            </w:r>
+          </w:p>
+        </w:tc>
+        <w:tc>
+          <w:tcPr>
+            <w:tcW w:w="0" w:type="auto"/>
+            <w:tcBorders>
+              <w:top w:val="single" w:sz="6" w:space="0" w:color="C4C7C5"/>
+              <w:left w:val="single" w:sz="6" w:space="0" w:color="C4C7C5"/>
+              <w:bottom w:val="single" w:sz="6" w:space="0" w:color="C4C7C5"/>
+              <w:right w:val="single" w:sz="6" w:space="0" w:color="C4C7C5"/>
+            </w:tcBorders>
+            <w:tcMar>
+              <w:top w:w="120" w:type="dxa"/>
+              <w:left w:w="180" w:type="dxa"/>
+              <w:bottom w:w="120" w:type="dxa"/>
+              <w:right w:w="180" w:type="dxa"/>
+            </w:tcMar>
+            <w:vAlign w:val="center"/>
+            <w:hideMark/>
+          </w:tcPr>
+          <w:p>
+            <w:pPr>
+              <w:jc w:val="both"/>
+            </w:pPr>
+            <w:r>
+              <w:t>20 caractères</w:t>
+            </w:r>
+          </w:p>
+        </w:tc>
+      </w:tr>
+      <w:tr>
+        <w:trPr>
+          <w:tblCellSpacing w:w="15" w:type="dxa"/>
+        </w:trPr>
+        <w:tc>
+          <w:tcPr>
+            <w:tcW w:w="0" w:type="auto"/>
+            <w:tcBorders>
+              <w:top w:val="single" w:sz="6" w:space="0" w:color="C4C7C5"/>
+              <w:left w:val="single" w:sz="6" w:space="0" w:color="C4C7C5"/>
+              <w:bottom w:val="single" w:sz="6" w:space="0" w:color="C4C7C5"/>
+              <w:right w:val="single" w:sz="6" w:space="0" w:color="C4C7C5"/>
+            </w:tcBorders>
+            <w:tcMar>
+              <w:top w:w="120" w:type="dxa"/>
+              <w:left w:w="180" w:type="dxa"/>
+              <w:bottom w:w="120" w:type="dxa"/>
+              <w:right w:w="180" w:type="dxa"/>
+            </w:tcMar>
+            <w:vAlign w:val="center"/>
+            <w:hideMark/>
+          </w:tcPr>
+          <w:p>
+            <w:pPr>
+              <w:jc w:val="both"/>
+            </w:pPr>
+            <w:r>
+              <w:t>Identifiant unique du patch (</w:t>
+            </w:r>
+            <w:proofErr w:type="spellStart"/>
+            <w:r>
+              <w:t>id_patch</w:t>
+            </w:r>
+            <w:proofErr w:type="spellEnd"/>
+            <w:r>
+              <w:t xml:space="preserve">) </w:t>
+            </w:r>
+          </w:p>
+        </w:tc>
+        <w:tc>
+          <w:tcPr>
+            <w:tcW w:w="0" w:type="auto"/>
+            <w:tcBorders>
+              <w:top w:val="single" w:sz="6" w:space="0" w:color="C4C7C5"/>
+              <w:left w:val="single" w:sz="6" w:space="0" w:color="C4C7C5"/>
+              <w:bottom w:val="single" w:sz="6" w:space="0" w:color="C4C7C5"/>
+              <w:right w:val="single" w:sz="6" w:space="0" w:color="C4C7C5"/>
+            </w:tcBorders>
+            <w:tcMar>
+              <w:top w:w="120" w:type="dxa"/>
+              <w:left w:w="180" w:type="dxa"/>
+              <w:bottom w:w="120" w:type="dxa"/>
+              <w:right w:w="180" w:type="dxa"/>
+            </w:tcMar>
+            <w:vAlign w:val="center"/>
+            <w:hideMark/>
+          </w:tcPr>
+          <w:p>
+            <w:pPr>
+              <w:jc w:val="both"/>
+            </w:pPr>
+            <w:r>
+              <w:t>Numérique / Entier</w:t>
+            </w:r>
+          </w:p>
+        </w:tc>
+        <w:tc>
+          <w:tcPr>
+            <w:tcW w:w="0" w:type="auto"/>
+            <w:tcBorders>
+              <w:top w:val="single" w:sz="6" w:space="0" w:color="C4C7C5"/>
+              <w:left w:val="single" w:sz="6" w:space="0" w:color="C4C7C5"/>
+              <w:bottom w:val="single" w:sz="6" w:space="0" w:color="C4C7C5"/>
+              <w:right w:val="single" w:sz="6" w:space="0" w:color="C4C7C5"/>
+            </w:tcBorders>
+            <w:tcMar>
+              <w:top w:w="120" w:type="dxa"/>
+              <w:left w:w="180" w:type="dxa"/>
+              <w:bottom w:w="120" w:type="dxa"/>
+              <w:right w:w="180" w:type="dxa"/>
+            </w:tcMar>
+            <w:vAlign w:val="center"/>
+            <w:hideMark/>
+          </w:tcPr>
+          <w:p>
+            <w:pPr>
+              <w:jc w:val="both"/>
+            </w:pPr>
+            <w:r>
+              <w:t>6 chiffres</w:t>
+            </w:r>
+          </w:p>
+        </w:tc>
+      </w:tr>
+      <w:tr>
+        <w:trPr>
+          <w:tblCellSpacing w:w="15" w:type="dxa"/>
+        </w:trPr>
+        <w:tc>
+          <w:tcPr>
+            <w:tcW w:w="0" w:type="auto"/>
+            <w:tcBorders>
+              <w:top w:val="single" w:sz="6" w:space="0" w:color="C4C7C5"/>
+              <w:left w:val="single" w:sz="6" w:space="0" w:color="C4C7C5"/>
+              <w:bottom w:val="single" w:sz="6" w:space="0" w:color="C4C7C5"/>
+              <w:right w:val="single" w:sz="6" w:space="0" w:color="C4C7C5"/>
+            </w:tcBorders>
+            <w:tcMar>
+              <w:top w:w="120" w:type="dxa"/>
+              <w:left w:w="180" w:type="dxa"/>
+              <w:bottom w:w="120" w:type="dxa"/>
+              <w:right w:w="180" w:type="dxa"/>
+            </w:tcMar>
+            <w:vAlign w:val="center"/>
+            <w:hideMark/>
+          </w:tcPr>
+          <w:p>
+            <w:pPr>
+              <w:jc w:val="both"/>
+            </w:pPr>
+            <w:r>
+              <w:t>Numéro de version du patch (</w:t>
+            </w:r>
+            <w:proofErr w:type="spellStart"/>
+            <w:r>
+              <w:t>num_version</w:t>
+            </w:r>
+            <w:proofErr w:type="spellEnd"/>
+            <w:r>
+              <w:t xml:space="preserve">) </w:t>
+            </w:r>
+          </w:p>
+        </w:tc>
+        <w:tc>
+          <w:tcPr>
+            <w:tcW w:w="0" w:type="auto"/>
+            <w:tcBorders>
+              <w:top w:val="single" w:sz="6" w:space="0" w:color="C4C7C5"/>
+              <w:left w:val="single" w:sz="6" w:space="0" w:color="C4C7C5"/>
+              <w:bottom w:val="single" w:sz="6" w:space="0" w:color="C4C7C5"/>
+              <w:right w:val="single" w:sz="6" w:space="0" w:color="C4C7C5"/>
+            </w:tcBorders>
+            <w:tcMar>
+              <w:top w:w="120" w:type="dxa"/>
+              <w:left w:w="180" w:type="dxa"/>
+              <w:bottom w:w="120" w:type="dxa"/>
+              <w:right w:w="180" w:type="dxa"/>
+            </w:tcMar>
+            <w:vAlign w:val="center"/>
+            <w:hideMark/>
+          </w:tcPr>
+          <w:p>
+            <w:pPr>
+              <w:jc w:val="both"/>
+            </w:pPr>
+            <w:proofErr w:type="spellStart"/>
+            <w:r>
+              <w:t>Alpha-numérique</w:t>
+            </w:r>
+            <w:proofErr w:type="spellEnd"/>
+            <w:r>
+              <w:t xml:space="preserve"> / Chaîne</w:t>
+            </w:r>
+          </w:p>
+        </w:tc>
+        <w:tc>
+          <w:tcPr>
+            <w:tcW w:w="0" w:type="auto"/>
+            <w:tcBorders>
+              <w:top w:val="single" w:sz="6" w:space="0" w:color="C4C7C5"/>
+              <w:left w:val="single" w:sz="6" w:space="0" w:color="C4C7C5"/>
+              <w:bottom w:val="single" w:sz="6" w:space="0" w:color="C4C7C5"/>
+              <w:right w:val="single" w:sz="6" w:space="0" w:color="C4C7C5"/>
+            </w:tcBorders>
+            <w:tcMar>
+              <w:top w:w="120" w:type="dxa"/>
+              <w:left w:w="180" w:type="dxa"/>
+              <w:bottom w:w="120" w:type="dxa"/>
+              <w:right w:w="180" w:type="dxa"/>
+            </w:tcMar>
+            <w:vAlign w:val="center"/>
+            <w:hideMark/>
+          </w:tcPr>
+          <w:p>
+            <w:pPr>
+              <w:jc w:val="both"/>
+            </w:pPr>
+            <w:r>
+              <w:t>10 caractères</w:t>
+            </w:r>
+          </w:p>
+        </w:tc>
+      </w:tr>
+      <w:tr>
+        <w:trPr>
+          <w:tblCellSpacing w:w="15" w:type="dxa"/>
+        </w:trPr>
+        <w:tc>
+          <w:tcPr>
+            <w:tcW w:w="0" w:type="auto"/>
+            <w:tcBorders>
+              <w:top w:val="single" w:sz="6" w:space="0" w:color="C4C7C5"/>
+              <w:left w:val="single" w:sz="6" w:space="0" w:color="C4C7C5"/>
+              <w:bottom w:val="single" w:sz="6" w:space="0" w:color="C4C7C5"/>
+              <w:right w:val="single" w:sz="6" w:space="0" w:color="C4C7C5"/>
+            </w:tcBorders>
+            <w:tcMar>
+              <w:top w:w="120" w:type="dxa"/>
+              <w:left w:w="180" w:type="dxa"/>
+              <w:bottom w:w="120" w:type="dxa"/>
+              <w:right w:w="180" w:type="dxa"/>
+            </w:tcMar>
+            <w:vAlign w:val="center"/>
+            <w:hideMark/>
+          </w:tcPr>
+          <w:p>
+            <w:pPr>
+              <w:jc w:val="both"/>
+            </w:pPr>
+            <w:r>
+              <w:t>Date de publication du patch (</w:t>
+            </w:r>
+            <w:proofErr w:type="spellStart"/>
+            <w:r>
+              <w:t>date_publication</w:t>
+            </w:r>
+            <w:proofErr w:type="spellEnd"/>
+            <w:r>
+              <w:t xml:space="preserve">) </w:t>
+            </w:r>
+          </w:p>
+        </w:tc>
+        <w:tc>
+          <w:tcPr>
+            <w:tcW w:w="0" w:type="auto"/>
+            <w:tcBorders>
+              <w:top w:val="single" w:sz="6" w:space="0" w:color="C4C7C5"/>
+              <w:left w:val="single" w:sz="6" w:space="0" w:color="C4C7C5"/>
+              <w:bottom w:val="single" w:sz="6" w:space="0" w:color="C4C7C5"/>
+              <w:right w:val="single" w:sz="6" w:space="0" w:color="C4C7C5"/>
+            </w:tcBorders>
+            <w:tcMar>
+              <w:top w:w="120" w:type="dxa"/>
+              <w:left w:w="180" w:type="dxa"/>
+              <w:bottom w:w="120" w:type="dxa"/>
+              <w:right w:w="180" w:type="dxa"/>
+            </w:tcMar>
+            <w:vAlign w:val="center"/>
+            <w:hideMark/>
+          </w:tcPr>
+          <w:p>
+            <w:pPr>
+              <w:jc w:val="both"/>
+            </w:pPr>
+            <w:r>
+              <w:t>Date</w:t>
+            </w:r>
+          </w:p>
+        </w:tc>
+        <w:tc>
+          <w:tcPr>
+            <w:tcW w:w="0" w:type="auto"/>
+            <w:tcBorders>
+              <w:top w:val="single" w:sz="6" w:space="0" w:color="C4C7C5"/>
+              <w:left w:val="single" w:sz="6" w:space="0" w:color="C4C7C5"/>
+              <w:bottom w:val="single" w:sz="6" w:space="0" w:color="C4C7C5"/>
+              <w:right w:val="single" w:sz="6" w:space="0" w:color="C4C7C5"/>
+            </w:tcBorders>
+            <w:tcMar>
+              <w:top w:w="120" w:type="dxa"/>
+              <w:left w:w="180" w:type="dxa"/>
+              <w:bottom w:w="120" w:type="dxa"/>
+              <w:right w:w="180" w:type="dxa"/>
+            </w:tcMar>
+            <w:vAlign w:val="center"/>
+            <w:hideMark/>
+          </w:tcPr>
+          <w:p>
+            <w:pPr>
+              <w:jc w:val="both"/>
+            </w:pPr>
+            <w:r>
+              <w:t>10 caractères</w:t>
+            </w:r>
+          </w:p>
+        </w:tc>
+      </w:tr>
+      <w:tr>
+        <w:trPr>
+          <w:tblCellSpacing w:w="15" w:type="dxa"/>
+        </w:trPr>
+        <w:tc>
+          <w:tcPr>
+            <w:tcW w:w="0" w:type="auto"/>
+            <w:tcBorders>
+              <w:top w:val="single" w:sz="6" w:space="0" w:color="C4C7C5"/>
+              <w:left w:val="single" w:sz="6" w:space="0" w:color="C4C7C5"/>
+              <w:bottom w:val="single" w:sz="6" w:space="0" w:color="C4C7C5"/>
+              <w:right w:val="single" w:sz="6" w:space="0" w:color="C4C7C5"/>
+            </w:tcBorders>
+            <w:tcMar>
+              <w:top w:w="120" w:type="dxa"/>
+              <w:left w:w="180" w:type="dxa"/>
+              <w:bottom w:w="120" w:type="dxa"/>
+              <w:right w:w="180" w:type="dxa"/>
+            </w:tcMar>
+            <w:vAlign w:val="center"/>
+            <w:hideMark/>
+          </w:tcPr>
+          <w:p>
+            <w:pPr>
+              <w:jc w:val="both"/>
+            </w:pPr>
+            <w:r>
+              <w:t>Identifiant unique du personnage (</w:t>
+            </w:r>
+            <w:proofErr w:type="spellStart"/>
+            <w:r>
+              <w:t>id_personnage</w:t>
+            </w:r>
+            <w:proofErr w:type="spellEnd"/>
+            <w:r>
+              <w:t xml:space="preserve">) </w:t>
+            </w:r>
+          </w:p>
+        </w:tc>
+        <w:tc>
+          <w:tcPr>
+            <w:tcW w:w="0" w:type="auto"/>
+            <w:tcBorders>
+              <w:top w:val="single" w:sz="6" w:space="0" w:color="C4C7C5"/>
+              <w:left w:val="single" w:sz="6" w:space="0" w:color="C4C7C5"/>
+              <w:bottom w:val="single" w:sz="6" w:space="0" w:color="C4C7C5"/>
+              <w:right w:val="single" w:sz="6" w:space="0" w:color="C4C7C5"/>
+            </w:tcBorders>
+            <w:tcMar>
+              <w:top w:w="120" w:type="dxa"/>
+              <w:left w:w="180" w:type="dxa"/>
+              <w:bottom w:w="120" w:type="dxa"/>
+              <w:right w:w="180" w:type="dxa"/>
+            </w:tcMar>
+            <w:vAlign w:val="center"/>
+            <w:hideMark/>
+          </w:tcPr>
+          <w:p>
+            <w:pPr>
+              <w:jc w:val="both"/>
+            </w:pPr>
+            <w:r>
+              <w:t>Numérique / Entier</w:t>
+            </w:r>
+          </w:p>
+        </w:tc>
+        <w:tc>
+          <w:tcPr>
+            <w:tcW w:w="0" w:type="auto"/>
+            <w:tcBorders>
+              <w:top w:val="single" w:sz="6" w:space="0" w:color="C4C7C5"/>
+              <w:left w:val="single" w:sz="6" w:space="0" w:color="C4C7C5"/>
+              <w:bottom w:val="single" w:sz="6" w:space="0" w:color="C4C7C5"/>
+              <w:right w:val="single" w:sz="6" w:space="0" w:color="C4C7C5"/>
+            </w:tcBorders>
+            <w:tcMar>
+              <w:top w:w="120" w:type="dxa"/>
+              <w:left w:w="180" w:type="dxa"/>
+              <w:bottom w:w="120" w:type="dxa"/>
+              <w:right w:w="180" w:type="dxa"/>
+            </w:tcMar>
+            <w:vAlign w:val="center"/>
+            <w:hideMark/>
+          </w:tcPr>
+          <w:p>
+            <w:pPr>
+              <w:jc w:val="both"/>
+            </w:pPr>
+            <w:r>
+              <w:t>6 chiffres</w:t>
+            </w:r>
+          </w:p>
+        </w:tc>
+      </w:tr>
+      <w:tr>
+        <w:trPr>
+          <w:tblCellSpacing w:w="15" w:type="dxa"/>
+        </w:trPr>
+        <w:tc>
+          <w:tcPr>
+            <w:tcW w:w="0" w:type="auto"/>
+            <w:tcBorders>
+              <w:top w:val="single" w:sz="6" w:space="0" w:color="C4C7C5"/>
+              <w:left w:val="single" w:sz="6" w:space="0" w:color="C4C7C5"/>
+              <w:bottom w:val="single" w:sz="6" w:space="0" w:color="C4C7C5"/>
+              <w:right w:val="single" w:sz="6" w:space="0" w:color="C4C7C5"/>
+            </w:tcBorders>
+            <w:tcMar>
+              <w:top w:w="120" w:type="dxa"/>
+              <w:left w:w="180" w:type="dxa"/>
+              <w:bottom w:w="120" w:type="dxa"/>
+              <w:right w:w="180" w:type="dxa"/>
+            </w:tcMar>
+            <w:vAlign w:val="center"/>
+            <w:hideMark/>
+          </w:tcPr>
+          <w:p>
+            <w:pPr>
+              <w:jc w:val="both"/>
+            </w:pPr>
+            <w:r>
+              <w:t>Nom du personnage (</w:t>
+            </w:r>
+            <w:proofErr w:type="spellStart"/>
+            <w:r>
+              <w:t>nom_personnage</w:t>
+            </w:r>
+            <w:proofErr w:type="spellEnd"/>
+            <w:r>
+              <w:t xml:space="preserve">) </w:t>
+            </w:r>
+          </w:p>
+        </w:tc>
+        <w:tc>
+          <w:tcPr>
+            <w:tcW w:w="0" w:type="auto"/>
+            <w:tcBorders>
+              <w:top w:val="single" w:sz="6" w:space="0" w:color="C4C7C5"/>
+              <w:left w:val="single" w:sz="6" w:space="0" w:color="C4C7C5"/>
+              <w:bottom w:val="single" w:sz="6" w:space="0" w:color="C4C7C5"/>
+              <w:right w:val="single" w:sz="6" w:space="0" w:color="C4C7C5"/>
+            </w:tcBorders>
+            <w:tcMar>
+              <w:top w:w="120" w:type="dxa"/>
+              <w:left w:w="180" w:type="dxa"/>
+              <w:bottom w:w="120" w:type="dxa"/>
+              <w:right w:w="180" w:type="dxa"/>
+            </w:tcMar>
+            <w:vAlign w:val="center"/>
+            <w:hideMark/>
+          </w:tcPr>
+          <w:p>
+            <w:pPr>
+              <w:jc w:val="both"/>
+            </w:pPr>
+            <w:r>
+              <w:t>Alphabétique / Chaîne</w:t>
+            </w:r>
+          </w:p>
+        </w:tc>
+        <w:tc>
+          <w:tcPr>
+            <w:tcW w:w="0" w:type="auto"/>
+            <w:tcBorders>
+              <w:top w:val="single" w:sz="6" w:space="0" w:color="C4C7C5"/>
+              <w:left w:val="single" w:sz="6" w:space="0" w:color="C4C7C5"/>
+              <w:bottom w:val="single" w:sz="6" w:space="0" w:color="C4C7C5"/>
+              <w:right w:val="single" w:sz="6" w:space="0" w:color="C4C7C5"/>
+            </w:tcBorders>
+            <w:tcMar>
+              <w:top w:w="120" w:type="dxa"/>
+              <w:left w:w="180" w:type="dxa"/>
+              <w:bottom w:w="120" w:type="dxa"/>
+              <w:right w:w="180" w:type="dxa"/>
+            </w:tcMar>
+            <w:vAlign w:val="center"/>
+            <w:hideMark/>
+          </w:tcPr>
+          <w:p>
+            <w:pPr>
+              <w:jc w:val="both"/>
+            </w:pPr>
+            <w:r>
+              <w:t>30 caractères</w:t>
+            </w:r>
+          </w:p>
+        </w:tc>
+      </w:tr>
+      <w:tr>
+        <w:trPr>
+          <w:tblCellSpacing w:w="15" w:type="dxa"/>
+        </w:trPr>
+        <w:tc>
+          <w:tcPr>
+            <w:tcW w:w="0" w:type="auto"/>
+            <w:tcBorders>
+              <w:top w:val="single" w:sz="6" w:space="0" w:color="C4C7C5"/>
+              <w:left w:val="single" w:sz="6" w:space="0" w:color="C4C7C5"/>
+              <w:bottom w:val="single" w:sz="6" w:space="0" w:color="C4C7C5"/>
+              <w:right w:val="single" w:sz="6" w:space="0" w:color="C4C7C5"/>
+            </w:tcBorders>
+            <w:tcMar>
+              <w:top w:w="120" w:type="dxa"/>
+              <w:left w:w="180" w:type="dxa"/>
+              <w:bottom w:w="120" w:type="dxa"/>
+              <w:right w:w="180" w:type="dxa"/>
+            </w:tcMar>
+            <w:vAlign w:val="center"/>
+            <w:hideMark/>
+          </w:tcPr>
+          <w:p>
+            <w:pPr>
+              <w:jc w:val="both"/>
+            </w:pPr>
+            <w:r>
+              <w:t>Rôle du personnage (</w:t>
+            </w:r>
+            <w:proofErr w:type="spellStart"/>
+            <w:r>
+              <w:t>role_personnage</w:t>
+            </w:r>
+            <w:proofErr w:type="spellEnd"/>
+            <w:r>
+              <w:t xml:space="preserve">) </w:t>
+            </w:r>
+          </w:p>
+        </w:tc>
+        <w:tc>
+          <w:tcPr>
+            <w:tcW w:w="0" w:type="auto"/>
+            <w:tcBorders>
+              <w:top w:val="single" w:sz="6" w:space="0" w:color="C4C7C5"/>
+              <w:left w:val="single" w:sz="6" w:space="0" w:color="C4C7C5"/>
+              <w:bottom w:val="single" w:sz="6" w:space="0" w:color="C4C7C5"/>
+              <w:right w:val="single" w:sz="6" w:space="0" w:color="C4C7C5"/>
+            </w:tcBorders>
+            <w:tcMar>
+              <w:top w:w="120" w:type="dxa"/>
+              <w:left w:w="180" w:type="dxa"/>
+              <w:bottom w:w="120" w:type="dxa"/>
+              <w:right w:w="180" w:type="dxa"/>
+            </w:tcMar>
+            <w:vAlign w:val="center"/>
+            <w:hideMark/>
+          </w:tcPr>
+          <w:p>
+            <w:pPr>
+              <w:jc w:val="both"/>
+            </w:pPr>
+            <w:r>
+              <w:t>Alphabétique / Chaîne</w:t>
+            </w:r>
+          </w:p>
+        </w:tc>
+        <w:tc>
+          <w:tcPr>
+            <w:tcW w:w="0" w:type="auto"/>
+            <w:tcBorders>
+              <w:top w:val="single" w:sz="6" w:space="0" w:color="C4C7C5"/>
+              <w:left w:val="single" w:sz="6" w:space="0" w:color="C4C7C5"/>
+              <w:bottom w:val="single" w:sz="6" w:space="0" w:color="C4C7C5"/>
+              <w:right w:val="single" w:sz="6" w:space="0" w:color="C4C7C5"/>
+            </w:tcBorders>
+            <w:tcMar>
+              <w:top w:w="120" w:type="dxa"/>
+              <w:left w:w="180" w:type="dxa"/>
+              <w:bottom w:w="120" w:type="dxa"/>
+              <w:right w:w="180" w:type="dxa"/>
+            </w:tcMar>
+            <w:vAlign w:val="center"/>
+            <w:hideMark/>
+          </w:tcPr>
+          <w:p>
+            <w:pPr>
+              <w:jc w:val="both"/>
+            </w:pPr>
+            <w:r>
+              <w:t>20 caractères</w:t>
+            </w:r>
+          </w:p>
+        </w:tc>
+      </w:tr>
+      <w:tr>
+        <w:trPr>
+          <w:tblCellSpacing w:w="15" w:type="dxa"/>
+        </w:trPr>
+        <w:tc>
+          <w:tcPr>
+            <w:tcW w:w="0" w:type="auto"/>
+            <w:tcBorders>
+              <w:top w:val="single" w:sz="6" w:space="0" w:color="C4C7C5"/>
+              <w:left w:val="single" w:sz="6" w:space="0" w:color="C4C7C5"/>
+              <w:bottom w:val="single" w:sz="6" w:space="0" w:color="C4C7C5"/>
+              <w:right w:val="single" w:sz="6" w:space="0" w:color="C4C7C5"/>
+            </w:tcBorders>
+            <w:tcMar>
+              <w:top w:w="120" w:type="dxa"/>
+              <w:left w:w="180" w:type="dxa"/>
+              <w:bottom w:w="120" w:type="dxa"/>
+              <w:right w:w="180" w:type="dxa"/>
+            </w:tcMar>
+            <w:vAlign w:val="center"/>
+            <w:hideMark/>
+          </w:tcPr>
+          <w:p>
+            <w:pPr>
+              <w:jc w:val="both"/>
+            </w:pPr>
+            <w:r>
+              <w:t>Date d'ajout du personnage (</w:t>
+            </w:r>
+            <w:proofErr w:type="spellStart"/>
+            <w:r>
+              <w:t>date_ajout_personnage</w:t>
+            </w:r>
+            <w:proofErr w:type="spellEnd"/>
+            <w:r>
+              <w:t xml:space="preserve">) </w:t>
+            </w:r>
+          </w:p>
+        </w:tc>
+        <w:tc>
+          <w:tcPr>
+            <w:tcW w:w="0" w:type="auto"/>
+            <w:tcBorders>
+              <w:top w:val="single" w:sz="6" w:space="0" w:color="C4C7C5"/>
+              <w:left w:val="single" w:sz="6" w:space="0" w:color="C4C7C5"/>
+              <w:bottom w:val="single" w:sz="6" w:space="0" w:color="C4C7C5"/>
+              <w:right w:val="single" w:sz="6" w:space="0" w:color="C4C7C5"/>
+            </w:tcBorders>
+            <w:tcMar>
+              <w:top w:w="120" w:type="dxa"/>
+              <w:left w:w="180" w:type="dxa"/>
+              <w:bottom w:w="120" w:type="dxa"/>
+              <w:right w:w="180" w:type="dxa"/>
+            </w:tcMar>
+            <w:vAlign w:val="center"/>
+            <w:hideMark/>
+          </w:tcPr>
+          <w:p>
+            <w:pPr>
+              <w:jc w:val="both"/>
+            </w:pPr>
+            <w:r>
+              <w:t>Date</w:t>
+            </w:r>
+          </w:p>
+        </w:tc>
+        <w:tc>
+          <w:tcPr>
+            <w:tcW w:w="0" w:type="auto"/>
+            <w:tcBorders>
+              <w:top w:val="single" w:sz="6" w:space="0" w:color="C4C7C5"/>
+              <w:left w:val="single" w:sz="6" w:space="0" w:color="C4C7C5"/>
+              <w:bottom w:val="single" w:sz="6" w:space="0" w:color="C4C7C5"/>
+              <w:right w:val="single" w:sz="6" w:space="0" w:color="C4C7C5"/>
+            </w:tcBorders>
+            <w:tcMar>
+              <w:top w:w="120" w:type="dxa"/>
+              <w:left w:w="180" w:type="dxa"/>
+              <w:bottom w:w="120" w:type="dxa"/>
+              <w:right w:w="180" w:type="dxa"/>
+            </w:tcMar>
+            <w:vAlign w:val="center"/>
+            <w:hideMark/>
+          </w:tcPr>
+          <w:p>
+            <w:pPr>
+              <w:jc w:val="both"/>
+            </w:pPr>
+            <w:r>
+              <w:t>10 caractères</w:t>
+            </w:r>
+          </w:p>
+        </w:tc>
+      </w:tr>
+      <w:tr>
+        <w:trPr>
+          <w:tblCellSpacing w:w="15" w:type="dxa"/>
+        </w:trPr>
+        <w:tc>
+          <w:tcPr>
+            <w:tcW w:w="0" w:type="auto"/>
+            <w:tcBorders>
+              <w:top w:val="single" w:sz="6" w:space="0" w:color="C4C7C5"/>
+              <w:left w:val="single" w:sz="6" w:space="0" w:color="C4C7C5"/>
+              <w:bottom w:val="single" w:sz="6" w:space="0" w:color="C4C7C5"/>
+              <w:right w:val="single" w:sz="6" w:space="0" w:color="C4C7C5"/>
+            </w:tcBorders>
+            <w:tcMar>
+              <w:top w:w="120" w:type="dxa"/>
+              <w:left w:w="180" w:type="dxa"/>
+              <w:bottom w:w="120" w:type="dxa"/>
+              <w:right w:w="180" w:type="dxa"/>
+            </w:tcMar>
+            <w:vAlign w:val="center"/>
+            <w:hideMark/>
+          </w:tcPr>
+          <w:p>
+            <w:pPr>
+              <w:jc w:val="both"/>
+            </w:pPr>
+            <w:r>
+              <w:t>Identifiant unique de la partie (</w:t>
+            </w:r>
+            <w:proofErr w:type="spellStart"/>
+            <w:r>
+              <w:t>id_partie</w:t>
+            </w:r>
+            <w:proofErr w:type="spellEnd"/>
+            <w:r>
+              <w:t xml:space="preserve">) </w:t>
+            </w:r>
+          </w:p>
+        </w:tc>
+        <w:tc>
+          <w:tcPr>
+            <w:tcW w:w="0" w:type="auto"/>
+            <w:tcBorders>
+              <w:top w:val="single" w:sz="6" w:space="0" w:color="C4C7C5"/>
+              <w:left w:val="single" w:sz="6" w:space="0" w:color="C4C7C5"/>
+              <w:bottom w:val="single" w:sz="6" w:space="0" w:color="C4C7C5"/>
+              <w:right w:val="single" w:sz="6" w:space="0" w:color="C4C7C5"/>
+            </w:tcBorders>
+            <w:tcMar>
+              <w:top w:w="120" w:type="dxa"/>
+              <w:left w:w="180" w:type="dxa"/>
+              <w:bottom w:w="120" w:type="dxa"/>
+              <w:right w:w="180" w:type="dxa"/>
+            </w:tcMar>
+            <w:vAlign w:val="center"/>
+            <w:hideMark/>
+          </w:tcPr>
+          <w:p>
+            <w:pPr>
+              <w:jc w:val="both"/>
+            </w:pPr>
+            <w:r>
+              <w:t>Numérique / Entier</w:t>
+            </w:r>
+          </w:p>
+        </w:tc>
+        <w:tc>
+          <w:tcPr>
+            <w:tcW w:w="0" w:type="auto"/>
+            <w:tcBorders>
+              <w:top w:val="single" w:sz="6" w:space="0" w:color="C4C7C5"/>
+              <w:left w:val="single" w:sz="6" w:space="0" w:color="C4C7C5"/>
+              <w:bottom w:val="single" w:sz="6" w:space="0" w:color="C4C7C5"/>
+              <w:right w:val="single" w:sz="6" w:space="0" w:color="C4C7C5"/>
+            </w:tcBorders>
+            <w:tcMar>
+              <w:top w:w="120" w:type="dxa"/>
+              <w:left w:w="180" w:type="dxa"/>
+              <w:bottom w:w="120" w:type="dxa"/>
+              <w:right w:w="180" w:type="dxa"/>
+            </w:tcMar>
+            <w:vAlign w:val="center"/>
+            <w:hideMark/>
+          </w:tcPr>
+          <w:p>
+            <w:pPr>
+              <w:jc w:val="both"/>
+            </w:pPr>
+            <w:r>
+              <w:t>10 chiffres</w:t>
+            </w:r>
+          </w:p>
+        </w:tc>
+      </w:tr>
+      <w:tr>
+        <w:trPr>
+          <w:tblCellSpacing w:w="15" w:type="dxa"/>
+        </w:trPr>
+        <w:tc>
+          <w:tcPr>
+            <w:tcW w:w="0" w:type="auto"/>
+            <w:tcBorders>
+              <w:top w:val="single" w:sz="6" w:space="0" w:color="C4C7C5"/>
+              <w:left w:val="single" w:sz="6" w:space="0" w:color="C4C7C5"/>
+              <w:bottom w:val="single" w:sz="6" w:space="0" w:color="C4C7C5"/>
+              <w:right w:val="single" w:sz="6" w:space="0" w:color="C4C7C5"/>
+            </w:tcBorders>
+            <w:tcMar>
+              <w:top w:w="120" w:type="dxa"/>
+              <w:left w:w="180" w:type="dxa"/>
+              <w:bottom w:w="120" w:type="dxa"/>
+              <w:right w:w="180" w:type="dxa"/>
+            </w:tcMar>
+            <w:vAlign w:val="center"/>
+            <w:hideMark/>
+          </w:tcPr>
+          <w:p>
+            <w:pPr>
+              <w:jc w:val="both"/>
+            </w:pPr>
+            <w:r>
+              <w:t>Date et heure de la partie (</w:t>
+            </w:r>
+            <w:proofErr w:type="spellStart"/>
+            <w:r>
+              <w:t>date_partie</w:t>
+            </w:r>
+            <w:proofErr w:type="spellEnd"/>
+            <w:r>
+              <w:t xml:space="preserve">) </w:t>
+            </w:r>
+          </w:p>
+        </w:tc>
+        <w:tc>
+          <w:tcPr>
+            <w:tcW w:w="0" w:type="auto"/>
+            <w:tcBorders>
+              <w:top w:val="single" w:sz="6" w:space="0" w:color="C4C7C5"/>
+              <w:left w:val="single" w:sz="6" w:space="0" w:color="C4C7C5"/>
+              <w:bottom w:val="single" w:sz="6" w:space="0" w:color="C4C7C5"/>
+              <w:right w:val="single" w:sz="6" w:space="0" w:color="C4C7C5"/>
+            </w:tcBorders>
+            <w:tcMar>
+              <w:top w:w="120" w:type="dxa"/>
+              <w:left w:w="180" w:type="dxa"/>
+              <w:bottom w:w="120" w:type="dxa"/>
+              <w:right w:w="180" w:type="dxa"/>
+            </w:tcMar>
+            <w:vAlign w:val="center"/>
+            <w:hideMark/>
+          </w:tcPr>
+          <w:p>
+            <w:pPr>
+              <w:jc w:val="both"/>
+            </w:pPr>
+            <w:r>
+              <w:t>Date-Heure</w:t>
+            </w:r>
+          </w:p>
+        </w:tc>
+        <w:tc>
+          <w:tcPr>
+            <w:tcW w:w="0" w:type="auto"/>
+            <w:tcBorders>
+              <w:top w:val="single" w:sz="6" w:space="0" w:color="C4C7C5"/>
+              <w:left w:val="single" w:sz="6" w:space="0" w:color="C4C7C5"/>
+              <w:bottom w:val="single" w:sz="6" w:space="0" w:color="C4C7C5"/>
+              <w:right w:val="single" w:sz="6" w:space="0" w:color="C4C7C5"/>
+            </w:tcBorders>
+            <w:tcMar>
+              <w:top w:w="120" w:type="dxa"/>
+              <w:left w:w="180" w:type="dxa"/>
+              <w:bottom w:w="120" w:type="dxa"/>
+              <w:right w:w="180" w:type="dxa"/>
+            </w:tcMar>
+            <w:vAlign w:val="center"/>
+            <w:hideMark/>
+          </w:tcPr>
+          <w:p>
+            <w:pPr>
+              <w:jc w:val="both"/>
+            </w:pPr>
+            <w:r>
+              <w:t>19 caractères</w:t>
+            </w:r>
+          </w:p>
+        </w:tc>
+      </w:tr>
+      <w:tr>
+        <w:trPr>
+          <w:tblCellSpacing w:w="15" w:type="dxa"/>
+        </w:trPr>
+        <w:tc>
+          <w:tcPr>
+            <w:tcW w:w="0" w:type="auto"/>
+            <w:tcBorders>
+              <w:top w:val="single" w:sz="6" w:space="0" w:color="C4C7C5"/>
+              <w:left w:val="single" w:sz="6" w:space="0" w:color="C4C7C5"/>
+              <w:bottom w:val="single" w:sz="6" w:space="0" w:color="C4C7C5"/>
+              <w:right w:val="single" w:sz="6" w:space="0" w:color="C4C7C5"/>
+            </w:tcBorders>
+            <w:tcMar>
+              <w:top w:w="120" w:type="dxa"/>
+              <w:left w:w="180" w:type="dxa"/>
+              <w:bottom w:w="120" w:type="dxa"/>
+              <w:right w:w="180" w:type="dxa"/>
+            </w:tcMar>
+            <w:vAlign w:val="center"/>
+            <w:hideMark/>
+          </w:tcPr>
+          <w:p>
+            <w:pPr>
+              <w:jc w:val="both"/>
+            </w:pPr>
+            <w:r>
+              <w:lastRenderedPageBreak/>
+              <w:t>Mode de jeu (</w:t>
+            </w:r>
+            <w:proofErr w:type="spellStart"/>
+            <w:r>
+              <w:t>mode_jeu</w:t>
+            </w:r>
+            <w:proofErr w:type="spellEnd"/>
+            <w:r>
+              <w:t xml:space="preserve">) </w:t>
+            </w:r>
+          </w:p>
+        </w:tc>
+        <w:tc>
+          <w:tcPr>
+            <w:tcW w:w="0" w:type="auto"/>
+            <w:tcBorders>
+              <w:top w:val="single" w:sz="6" w:space="0" w:color="C4C7C5"/>
+              <w:left w:val="single" w:sz="6" w:space="0" w:color="C4C7C5"/>
+              <w:bottom w:val="single" w:sz="6" w:space="0" w:color="C4C7C5"/>
+              <w:right w:val="single" w:sz="6" w:space="0" w:color="C4C7C5"/>
+            </w:tcBorders>
+            <w:tcMar>
+              <w:top w:w="120" w:type="dxa"/>
+              <w:left w:w="180" w:type="dxa"/>
+              <w:bottom w:w="120" w:type="dxa"/>
+              <w:right w:w="180" w:type="dxa"/>
+            </w:tcMar>
+            <w:vAlign w:val="center"/>
+            <w:hideMark/>
+          </w:tcPr>
+          <w:p>
+            <w:pPr>
+              <w:jc w:val="both"/>
+            </w:pPr>
+            <w:r>
+              <w:t>Alphabétique / Chaîne</w:t>
+            </w:r>
+          </w:p>
+        </w:tc>
+        <w:tc>
+          <w:tcPr>
+            <w:tcW w:w="0" w:type="auto"/>
+            <w:tcBorders>
+              <w:top w:val="single" w:sz="6" w:space="0" w:color="C4C7C5"/>
+              <w:left w:val="single" w:sz="6" w:space="0" w:color="C4C7C5"/>
+              <w:bottom w:val="single" w:sz="6" w:space="0" w:color="C4C7C5"/>
+              <w:right w:val="single" w:sz="6" w:space="0" w:color="C4C7C5"/>
+            </w:tcBorders>
+            <w:tcMar>
+              <w:top w:w="120" w:type="dxa"/>
+              <w:left w:w="180" w:type="dxa"/>
+              <w:bottom w:w="120" w:type="dxa"/>
+              <w:right w:w="180" w:type="dxa"/>
+            </w:tcMar>
+            <w:vAlign w:val="center"/>
+            <w:hideMark/>
+          </w:tcPr>
+          <w:p>
+            <w:pPr>
+              <w:jc w:val="both"/>
+            </w:pPr>
+            <w:r>
+              <w:t>20 caractères</w:t>
+            </w:r>
+          </w:p>
+        </w:tc>
+      </w:tr>
+      <w:tr>
+        <w:trPr>
+          <w:tblCellSpacing w:w="15" w:type="dxa"/>
+        </w:trPr>
+        <w:tc>
+          <w:tcPr>
+            <w:tcW w:w="0" w:type="auto"/>
+            <w:tcBorders>
+              <w:top w:val="single" w:sz="6" w:space="0" w:color="C4C7C5"/>
+              <w:left w:val="single" w:sz="6" w:space="0" w:color="C4C7C5"/>
+              <w:bottom w:val="single" w:sz="6" w:space="0" w:color="C4C7C5"/>
+              <w:right w:val="single" w:sz="6" w:space="0" w:color="C4C7C5"/>
+            </w:tcBorders>
+            <w:tcMar>
+              <w:top w:w="120" w:type="dxa"/>
+              <w:left w:w="180" w:type="dxa"/>
+              <w:bottom w:w="120" w:type="dxa"/>
+              <w:right w:w="180" w:type="dxa"/>
+            </w:tcMar>
+            <w:vAlign w:val="center"/>
+            <w:hideMark/>
+          </w:tcPr>
+          <w:p>
+            <w:pPr>
+              <w:jc w:val="both"/>
+            </w:pPr>
+            <w:r>
+              <w:t>Durée de la partie (</w:t>
+            </w:r>
+            <w:proofErr w:type="spellStart"/>
+            <w:r>
+              <w:t>duree_partie</w:t>
+            </w:r>
+            <w:proofErr w:type="spellEnd"/>
+            <w:r>
+              <w:t xml:space="preserve">) </w:t>
+            </w:r>
+          </w:p>
+        </w:tc>
+        <w:tc>
+          <w:tcPr>
+            <w:tcW w:w="0" w:type="auto"/>
+            <w:tcBorders>
+              <w:top w:val="single" w:sz="6" w:space="0" w:color="C4C7C5"/>
+              <w:left w:val="single" w:sz="6" w:space="0" w:color="C4C7C5"/>
+              <w:bottom w:val="single" w:sz="6" w:space="0" w:color="C4C7C5"/>
+              <w:right w:val="single" w:sz="6" w:space="0" w:color="C4C7C5"/>
+            </w:tcBorders>
+            <w:tcMar>
+              <w:top w:w="120" w:type="dxa"/>
+              <w:left w:w="180" w:type="dxa"/>
+              <w:bottom w:w="120" w:type="dxa"/>
+              <w:right w:w="180" w:type="dxa"/>
+            </w:tcMar>
+            <w:vAlign w:val="center"/>
+            <w:hideMark/>
+          </w:tcPr>
+          <w:p>
+            <w:pPr>
+              <w:jc w:val="both"/>
+            </w:pPr>
+            <w:r>
+              <w:t>Numérique / Entier</w:t>
+            </w:r>
+          </w:p>
+        </w:tc>
+        <w:tc>
+          <w:tcPr>
+            <w:tcW w:w="0" w:type="auto"/>
+            <w:tcBorders>
+              <w:top w:val="single" w:sz="6" w:space="0" w:color="C4C7C5"/>
+              <w:left w:val="single" w:sz="6" w:space="0" w:color="C4C7C5"/>
+              <w:bottom w:val="single" w:sz="6" w:space="0" w:color="C4C7C5"/>
+              <w:right w:val="single" w:sz="6" w:space="0" w:color="C4C7C5"/>
+            </w:tcBorders>
+            <w:tcMar>
+              <w:top w:w="120" w:type="dxa"/>
+              <w:left w:w="180" w:type="dxa"/>
+              <w:bottom w:w="120" w:type="dxa"/>
+              <w:right w:w="180" w:type="dxa"/>
+            </w:tcMar>
+            <w:vAlign w:val="center"/>
+            <w:hideMark/>
+          </w:tcPr>
+          <w:p>
+            <w:pPr>
+              <w:jc w:val="both"/>
+            </w:pPr>
+            <w:r>
+              <w:t>5 chiffres</w:t>
+            </w:r>
+          </w:p>
+        </w:tc>
+      </w:tr>
+      <w:tr>
+        <w:trPr>
+          <w:tblCellSpacing w:w="15" w:type="dxa"/>
+        </w:trPr>
+        <w:tc>
+          <w:tcPr>
+            <w:tcW w:w="0" w:type="auto"/>
+            <w:tcBorders>
+              <w:top w:val="single" w:sz="6" w:space="0" w:color="C4C7C5"/>
+              <w:left w:val="single" w:sz="6" w:space="0" w:color="C4C7C5"/>
+              <w:bottom w:val="single" w:sz="6" w:space="0" w:color="C4C7C5"/>
+              <w:right w:val="single" w:sz="6" w:space="0" w:color="C4C7C5"/>
+            </w:tcBorders>
+            <w:tcMar>
+              <w:top w:w="120" w:type="dxa"/>
+              <w:left w:w="180" w:type="dxa"/>
+              <w:bottom w:w="120" w:type="dxa"/>
+              <w:right w:w="180" w:type="dxa"/>
+            </w:tcMar>
+            <w:vAlign w:val="center"/>
+            <w:hideMark/>
+          </w:tcPr>
+          <w:p>
+            <w:pPr>
+              <w:jc w:val="both"/>
+            </w:pPr>
+            <w:r>
+              <w:t>Résultat de la partie (</w:t>
+            </w:r>
+            <w:proofErr w:type="spellStart"/>
+            <w:r>
+              <w:t>resultat_partie</w:t>
+            </w:r>
+            <w:proofErr w:type="spellEnd"/>
+            <w:r>
+              <w:t xml:space="preserve">) </w:t>
+            </w:r>
+          </w:p>
+        </w:tc>
+        <w:tc>
+          <w:tcPr>
+            <w:tcW w:w="0" w:type="auto"/>
+            <w:tcBorders>
+              <w:top w:val="single" w:sz="6" w:space="0" w:color="C4C7C5"/>
+              <w:left w:val="single" w:sz="6" w:space="0" w:color="C4C7C5"/>
+              <w:bottom w:val="single" w:sz="6" w:space="0" w:color="C4C7C5"/>
+              <w:right w:val="single" w:sz="6" w:space="0" w:color="C4C7C5"/>
+            </w:tcBorders>
+            <w:tcMar>
+              <w:top w:w="120" w:type="dxa"/>
+              <w:left w:w="180" w:type="dxa"/>
+              <w:bottom w:w="120" w:type="dxa"/>
+              <w:right w:w="180" w:type="dxa"/>
+            </w:tcMar>
+            <w:vAlign w:val="center"/>
+            <w:hideMark/>
+          </w:tcPr>
+          <w:p>
+            <w:pPr>
+              <w:jc w:val="both"/>
+            </w:pPr>
+            <w:r>
+              <w:t>Alphabétique / Chaîne</w:t>
+            </w:r>
+          </w:p>
+        </w:tc>
+        <w:tc>
+          <w:tcPr>
+            <w:tcW w:w="0" w:type="auto"/>
+            <w:tcBorders>
+              <w:top w:val="single" w:sz="6" w:space="0" w:color="C4C7C5"/>
+              <w:left w:val="single" w:sz="6" w:space="0" w:color="C4C7C5"/>
+              <w:bottom w:val="single" w:sz="6" w:space="0" w:color="C4C7C5"/>
+              <w:right w:val="single" w:sz="6" w:space="0" w:color="C4C7C5"/>
+            </w:tcBorders>
+            <w:tcMar>
+              <w:top w:w="120" w:type="dxa"/>
+              <w:left w:w="180" w:type="dxa"/>
+              <w:bottom w:w="120" w:type="dxa"/>
+              <w:right w:w="180" w:type="dxa"/>
+            </w:tcMar>
+            <w:vAlign w:val="center"/>
+            <w:hideMark/>
+          </w:tcPr>
+          <w:p>
+            <w:pPr>
+              <w:jc w:val="both"/>
+            </w:pPr>
+            <w:r>
+              <w:t>10 caractères</w:t>
+            </w:r>
+          </w:p>
+        </w:tc>
+      </w:tr>
+      <w:tr>
+        <w:trPr>
+          <w:tblCellSpacing w:w="15" w:type="dxa"/>
+        </w:trPr>
+        <w:tc>
+          <w:tcPr>
+            <w:tcW w:w="0" w:type="auto"/>
+            <w:tcBorders>
+              <w:top w:val="single" w:sz="6" w:space="0" w:color="C4C7C5"/>
+              <w:left w:val="single" w:sz="6" w:space="0" w:color="C4C7C5"/>
+              <w:bottom w:val="single" w:sz="6" w:space="0" w:color="C4C7C5"/>
+              <w:right w:val="single" w:sz="6" w:space="0" w:color="C4C7C5"/>
+            </w:tcBorders>
+            <w:tcMar>
+              <w:top w:w="120" w:type="dxa"/>
+              <w:left w:w="180" w:type="dxa"/>
+              <w:bottom w:w="120" w:type="dxa"/>
+              <w:right w:w="180" w:type="dxa"/>
+            </w:tcMar>
+            <w:vAlign w:val="center"/>
+            <w:hideMark/>
+          </w:tcPr>
+          <w:p>
+            <w:pPr>
+              <w:jc w:val="both"/>
+            </w:pPr>
+            <w:r>
+              <w:t>Nombre d'éliminations en partie (</w:t>
+            </w:r>
+            <w:proofErr w:type="spellStart"/>
+            <w:r>
+              <w:t>nb_elimination</w:t>
+            </w:r>
+            <w:proofErr w:type="spellEnd"/>
+            <w:r>
+              <w:t xml:space="preserve">) </w:t>
+            </w:r>
+          </w:p>
+        </w:tc>
+        <w:tc>
+          <w:tcPr>
+            <w:tcW w:w="0" w:type="auto"/>
+            <w:tcBorders>
+              <w:top w:val="single" w:sz="6" w:space="0" w:color="C4C7C5"/>
+              <w:left w:val="single" w:sz="6" w:space="0" w:color="C4C7C5"/>
+              <w:bottom w:val="single" w:sz="6" w:space="0" w:color="C4C7C5"/>
+              <w:right w:val="single" w:sz="6" w:space="0" w:color="C4C7C5"/>
+            </w:tcBorders>
+            <w:tcMar>
+              <w:top w:w="120" w:type="dxa"/>
+              <w:left w:w="180" w:type="dxa"/>
+              <w:bottom w:w="120" w:type="dxa"/>
+              <w:right w:w="180" w:type="dxa"/>
+            </w:tcMar>
+            <w:vAlign w:val="center"/>
+            <w:hideMark/>
+          </w:tcPr>
+          <w:p>
+            <w:pPr>
+              <w:jc w:val="both"/>
+            </w:pPr>
+            <w:r>
+              <w:t>Numérique / Entier</w:t>
+            </w:r>
+          </w:p>
+        </w:tc>
+        <w:tc>
+          <w:tcPr>
+            <w:tcW w:w="0" w:type="auto"/>
+            <w:tcBorders>
+              <w:top w:val="single" w:sz="6" w:space="0" w:color="C4C7C5"/>
+              <w:left w:val="single" w:sz="6" w:space="0" w:color="C4C7C5"/>
+              <w:bottom w:val="single" w:sz="6" w:space="0" w:color="C4C7C5"/>
+              <w:right w:val="single" w:sz="6" w:space="0" w:color="C4C7C5"/>
+            </w:tcBorders>
+            <w:tcMar>
+              <w:top w:w="120" w:type="dxa"/>
+              <w:left w:w="180" w:type="dxa"/>
+              <w:bottom w:w="120" w:type="dxa"/>
+              <w:right w:w="180" w:type="dxa"/>
+            </w:tcMar>
+            <w:vAlign w:val="center"/>
+            <w:hideMark/>
+          </w:tcPr>
+          <w:p>
+            <w:pPr>
+              <w:jc w:val="both"/>
+            </w:pPr>
+            <w:r>
+              <w:t>3 chiffres</w:t>
+            </w:r>
+          </w:p>
+        </w:tc>
+      </w:tr>
+      <w:tr>
+        <w:trPr>
+          <w:tblCellSpacing w:w="15" w:type="dxa"/>
+        </w:trPr>
+        <w:tc>
+          <w:tcPr>
+            <w:tcW w:w="0" w:type="auto"/>
+            <w:tcBorders>
+              <w:top w:val="single" w:sz="6" w:space="0" w:color="C4C7C5"/>
+              <w:left w:val="single" w:sz="6" w:space="0" w:color="C4C7C5"/>
+              <w:bottom w:val="single" w:sz="6" w:space="0" w:color="C4C7C5"/>
+              <w:right w:val="single" w:sz="6" w:space="0" w:color="C4C7C5"/>
+            </w:tcBorders>
+            <w:tcMar>
+              <w:top w:w="120" w:type="dxa"/>
+              <w:left w:w="180" w:type="dxa"/>
+              <w:bottom w:w="120" w:type="dxa"/>
+              <w:right w:w="180" w:type="dxa"/>
+            </w:tcMar>
+            <w:vAlign w:val="center"/>
+            <w:hideMark/>
+          </w:tcPr>
+          <w:p>
+            <w:pPr>
+              <w:jc w:val="both"/>
+            </w:pPr>
+            <w:r>
+              <w:t>Score de la partie (</w:t>
+            </w:r>
+            <w:proofErr w:type="spellStart"/>
+            <w:r>
+              <w:t>score_partie</w:t>
+            </w:r>
+            <w:proofErr w:type="spellEnd"/>
+            <w:r>
+              <w:t xml:space="preserve">) </w:t>
+            </w:r>
+          </w:p>
+        </w:tc>
+        <w:tc>
+          <w:tcPr>
+            <w:tcW w:w="0" w:type="auto"/>
+            <w:tcBorders>
+              <w:top w:val="single" w:sz="6" w:space="0" w:color="C4C7C5"/>
+              <w:left w:val="single" w:sz="6" w:space="0" w:color="C4C7C5"/>
+              <w:bottom w:val="single" w:sz="6" w:space="0" w:color="C4C7C5"/>
+              <w:right w:val="single" w:sz="6" w:space="0" w:color="C4C7C5"/>
+            </w:tcBorders>
+            <w:tcMar>
+              <w:top w:w="120" w:type="dxa"/>
+              <w:left w:w="180" w:type="dxa"/>
+              <w:bottom w:w="120" w:type="dxa"/>
+              <w:right w:w="180" w:type="dxa"/>
+            </w:tcMar>
+            <w:vAlign w:val="center"/>
+            <w:hideMark/>
+          </w:tcPr>
+          <w:p>
+            <w:pPr>
+              <w:jc w:val="both"/>
+            </w:pPr>
+            <w:r>
+              <w:t>Numérique / Entier</w:t>
+            </w:r>
+          </w:p>
+        </w:tc>
+        <w:tc>
+          <w:tcPr>
+            <w:tcW w:w="0" w:type="auto"/>
+            <w:tcBorders>
+              <w:top w:val="single" w:sz="6" w:space="0" w:color="C4C7C5"/>
+              <w:left w:val="single" w:sz="6" w:space="0" w:color="C4C7C5"/>
+              <w:bottom w:val="single" w:sz="6" w:space="0" w:color="C4C7C5"/>
+              <w:right w:val="single" w:sz="6" w:space="0" w:color="C4C7C5"/>
+            </w:tcBorders>
+            <w:tcMar>
+              <w:top w:w="120" w:type="dxa"/>
+              <w:left w:w="180" w:type="dxa"/>
+              <w:bottom w:w="120" w:type="dxa"/>
+              <w:right w:w="180" w:type="dxa"/>
+            </w:tcMar>
+            <w:vAlign w:val="center"/>
+            <w:hideMark/>
+          </w:tcPr>
+          <w:p>
+            <w:pPr>
+              <w:jc w:val="both"/>
+            </w:pPr>
+            <w:r>
+              <w:t>6 chiffres</w:t>
+            </w:r>
+          </w:p>
+        </w:tc>
+      </w:tr>
+      <w:tr>
+        <w:trPr>
+          <w:tblCellSpacing w:w="15" w:type="dxa"/>
+        </w:trPr>
+        <w:tc>
+          <w:tcPr>
+            <w:tcW w:w="0" w:type="auto"/>
+            <w:tcBorders>
+              <w:top w:val="single" w:sz="6" w:space="0" w:color="C4C7C5"/>
+              <w:left w:val="single" w:sz="6" w:space="0" w:color="C4C7C5"/>
+              <w:bottom w:val="single" w:sz="6" w:space="0" w:color="C4C7C5"/>
+              <w:right w:val="single" w:sz="6" w:space="0" w:color="C4C7C5"/>
+            </w:tcBorders>
+            <w:tcMar>
+              <w:top w:w="120" w:type="dxa"/>
+              <w:left w:w="180" w:type="dxa"/>
+              <w:bottom w:w="120" w:type="dxa"/>
+              <w:right w:w="180" w:type="dxa"/>
+            </w:tcMar>
+            <w:vAlign w:val="center"/>
+            <w:hideMark/>
+          </w:tcPr>
+          <w:p>
+            <w:pPr>
+              <w:jc w:val="both"/>
+            </w:pPr>
+            <w:r>
+              <w:t>Identifiant unique de la transaction (</w:t>
+            </w:r>
+            <w:proofErr w:type="spellStart"/>
+            <w:r>
+              <w:t>id_transaction</w:t>
+            </w:r>
+            <w:proofErr w:type="spellEnd"/>
+            <w:r>
+              <w:t xml:space="preserve">) </w:t>
+            </w:r>
+          </w:p>
+        </w:tc>
+        <w:tc>
+          <w:tcPr>
+            <w:tcW w:w="0" w:type="auto"/>
+            <w:tcBorders>
+              <w:top w:val="single" w:sz="6" w:space="0" w:color="C4C7C5"/>
+              <w:left w:val="single" w:sz="6" w:space="0" w:color="C4C7C5"/>
+              <w:bottom w:val="single" w:sz="6" w:space="0" w:color="C4C7C5"/>
+              <w:right w:val="single" w:sz="6" w:space="0" w:color="C4C7C5"/>
+            </w:tcBorders>
+            <w:tcMar>
+              <w:top w:w="120" w:type="dxa"/>
+              <w:left w:w="180" w:type="dxa"/>
+              <w:bottom w:w="120" w:type="dxa"/>
+              <w:right w:w="180" w:type="dxa"/>
+            </w:tcMar>
+            <w:vAlign w:val="center"/>
+            <w:hideMark/>
+          </w:tcPr>
+          <w:p>
+            <w:pPr>
+              <w:jc w:val="both"/>
+            </w:pPr>
+            <w:r>
+              <w:t>Numérique / Entier</w:t>
+            </w:r>
+          </w:p>
+        </w:tc>
+        <w:tc>
+          <w:tcPr>
+            <w:tcW w:w="0" w:type="auto"/>
+            <w:tcBorders>
+              <w:top w:val="single" w:sz="6" w:space="0" w:color="C4C7C5"/>
+              <w:left w:val="single" w:sz="6" w:space="0" w:color="C4C7C5"/>
+              <w:bottom w:val="single" w:sz="6" w:space="0" w:color="C4C7C5"/>
+              <w:right w:val="single" w:sz="6" w:space="0" w:color="C4C7C5"/>
+            </w:tcBorders>
+            <w:tcMar>
+              <w:top w:w="120" w:type="dxa"/>
+              <w:left w:w="180" w:type="dxa"/>
+              <w:bottom w:w="120" w:type="dxa"/>
+              <w:right w:w="180" w:type="dxa"/>
+            </w:tcMar>
+            <w:vAlign w:val="center"/>
+            <w:hideMark/>
+          </w:tcPr>
+          <w:p>
+            <w:pPr>
+              <w:jc w:val="both"/>
+            </w:pPr>
+            <w:r>
+              <w:t>10 chiffres</w:t>
+            </w:r>
+          </w:p>
+        </w:tc>
+      </w:tr>
+      <w:tr>
+        <w:trPr>
+          <w:tblCellSpacing w:w="15" w:type="dxa"/>
+        </w:trPr>
+        <w:tc>
+          <w:tcPr>
+            <w:tcW w:w="0" w:type="auto"/>
+            <w:tcBorders>
+              <w:top w:val="single" w:sz="6" w:space="0" w:color="C4C7C5"/>
+              <w:left w:val="single" w:sz="6" w:space="0" w:color="C4C7C5"/>
+              <w:bottom w:val="single" w:sz="6" w:space="0" w:color="C4C7C5"/>
+              <w:right w:val="single" w:sz="6" w:space="0" w:color="C4C7C5"/>
+            </w:tcBorders>
+            <w:tcMar>
+              <w:top w:w="120" w:type="dxa"/>
+              <w:left w:w="180" w:type="dxa"/>
+              <w:bottom w:w="120" w:type="dxa"/>
+              <w:right w:w="180" w:type="dxa"/>
+            </w:tcMar>
+            <w:vAlign w:val="center"/>
+            <w:hideMark/>
+          </w:tcPr>
+          <w:p>
+            <w:pPr>
+              <w:jc w:val="both"/>
+            </w:pPr>
+            <w:r>
+              <w:t>Montant de la transaction (</w:t>
+            </w:r>
+            <w:proofErr w:type="spellStart"/>
+            <w:r>
+              <w:t>montant_transaction</w:t>
+            </w:r>
+            <w:proofErr w:type="spellEnd"/>
+            <w:r>
+              <w:t xml:space="preserve">) </w:t>
+            </w:r>
+          </w:p>
+        </w:tc>
+        <w:tc>
+          <w:tcPr>
+            <w:tcW w:w="0" w:type="auto"/>
+            <w:tcBorders>
+              <w:top w:val="single" w:sz="6" w:space="0" w:color="C4C7C5"/>
+              <w:left w:val="single" w:sz="6" w:space="0" w:color="C4C7C5"/>
+              <w:bottom w:val="single" w:sz="6" w:space="0" w:color="C4C7C5"/>
+              <w:right w:val="single" w:sz="6" w:space="0" w:color="C4C7C5"/>
+            </w:tcBorders>
+            <w:tcMar>
+              <w:top w:w="120" w:type="dxa"/>
+              <w:left w:w="180" w:type="dxa"/>
+              <w:bottom w:w="120" w:type="dxa"/>
+              <w:right w:w="180" w:type="dxa"/>
+            </w:tcMar>
+            <w:vAlign w:val="center"/>
+            <w:hideMark/>
+          </w:tcPr>
+          <w:p>
+            <w:pPr>
+              <w:jc w:val="both"/>
+            </w:pPr>
+            <w:r>
+              <w:t>Numérique / Décimal</w:t>
+            </w:r>
+          </w:p>
+        </w:tc>
+        <w:tc>
+          <w:tcPr>
+            <w:tcW w:w="0" w:type="auto"/>
+            <w:tcBorders>
+              <w:top w:val="single" w:sz="6" w:space="0" w:color="C4C7C5"/>
+              <w:left w:val="single" w:sz="6" w:space="0" w:color="C4C7C5"/>
+              <w:bottom w:val="single" w:sz="6" w:space="0" w:color="C4C7C5"/>
+              <w:right w:val="single" w:sz="6" w:space="0" w:color="C4C7C5"/>
+            </w:tcBorders>
+            <w:tcMar>
+              <w:top w:w="120" w:type="dxa"/>
+              <w:left w:w="180" w:type="dxa"/>
+              <w:bottom w:w="120" w:type="dxa"/>
+              <w:right w:w="180" w:type="dxa"/>
+            </w:tcMar>
+            <w:vAlign w:val="center"/>
+            <w:hideMark/>
+          </w:tcPr>
+          <w:p>
+            <w:pPr>
+              <w:jc w:val="both"/>
+            </w:pPr>
+            <w:r>
+              <w:t>8 chiffres</w:t>
+            </w:r>
+          </w:p>
+        </w:tc>
+      </w:tr>
+      <w:tr>
+        <w:trPr>
+          <w:tblCellSpacing w:w="15" w:type="dxa"/>
+        </w:trPr>
+        <w:tc>
+          <w:tcPr>
+            <w:tcW w:w="0" w:type="auto"/>
+            <w:tcBorders>
+              <w:top w:val="single" w:sz="6" w:space="0" w:color="C4C7C5"/>
+              <w:left w:val="single" w:sz="6" w:space="0" w:color="C4C7C5"/>
+              <w:bottom w:val="single" w:sz="6" w:space="0" w:color="C4C7C5"/>
+              <w:right w:val="single" w:sz="6" w:space="0" w:color="C4C7C5"/>
+            </w:tcBorders>
+            <w:tcMar>
+              <w:top w:w="120" w:type="dxa"/>
+              <w:left w:w="180" w:type="dxa"/>
+              <w:bottom w:w="120" w:type="dxa"/>
+              <w:right w:w="180" w:type="dxa"/>
+            </w:tcMar>
+            <w:vAlign w:val="center"/>
+            <w:hideMark/>
+          </w:tcPr>
+          <w:p>
+            <w:pPr>
+              <w:jc w:val="both"/>
+            </w:pPr>
+            <w:r>
+              <w:t>Date et heure de la transaction (</w:t>
+            </w:r>
+            <w:proofErr w:type="spellStart"/>
+            <w:r>
+              <w:t>date_transaction</w:t>
+            </w:r>
+            <w:proofErr w:type="spellEnd"/>
+            <w:r>
+              <w:t xml:space="preserve">) </w:t>
+            </w:r>
+          </w:p>
+        </w:tc>
+        <w:tc>
+          <w:tcPr>
+            <w:tcW w:w="0" w:type="auto"/>
+            <w:tcBorders>
+              <w:top w:val="single" w:sz="6" w:space="0" w:color="C4C7C5"/>
+              <w:left w:val="single" w:sz="6" w:space="0" w:color="C4C7C5"/>
+              <w:bottom w:val="single" w:sz="6" w:space="0" w:color="C4C7C5"/>
+              <w:right w:val="single" w:sz="6" w:space="0" w:color="C4C7C5"/>
+            </w:tcBorders>
+            <w:tcMar>
+              <w:top w:w="120" w:type="dxa"/>
+              <w:left w:w="180" w:type="dxa"/>
+              <w:bottom w:w="120" w:type="dxa"/>
+              <w:right w:w="180" w:type="dxa"/>
+            </w:tcMar>
+            <w:vAlign w:val="center"/>
+            <w:hideMark/>
+          </w:tcPr>
+          <w:p>
+            <w:pPr>
+              <w:jc w:val="both"/>
+            </w:pPr>
+            <w:r>
+              <w:t>Date-Heure</w:t>
+            </w:r>
+          </w:p>
+        </w:tc>
+        <w:tc>
+          <w:tcPr>
+            <w:tcW w:w="0" w:type="auto"/>
+            <w:tcBorders>
+              <w:top w:val="single" w:sz="6" w:space="0" w:color="C4C7C5"/>
+              <w:left w:val="single" w:sz="6" w:space="0" w:color="C4C7C5"/>
+              <w:bottom w:val="single" w:sz="6" w:space="0" w:color="C4C7C5"/>
+              <w:right w:val="single" w:sz="6" w:space="0" w:color="C4C7C5"/>
+            </w:tcBorders>
+            <w:tcMar>
+              <w:top w:w="120" w:type="dxa"/>
+              <w:left w:w="180" w:type="dxa"/>
+              <w:bottom w:w="120" w:type="dxa"/>
+              <w:right w:w="180" w:type="dxa"/>
+            </w:tcMar>
+            <w:vAlign w:val="center"/>
+            <w:hideMark/>
+          </w:tcPr>
+          <w:p>
+            <w:pPr>
+              <w:jc w:val="both"/>
+            </w:pPr>
+            <w:r>
+              <w:t>19 caractères</w:t>
+            </w:r>
+          </w:p>
+        </w:tc>
+      </w:tr>
+      <w:tr>
+        <w:trPr>
+          <w:tblCellSpacing w:w="15" w:type="dxa"/>
+        </w:trPr>
+        <w:tc>
+          <w:tcPr>
+            <w:tcW w:w="0" w:type="auto"/>
+            <w:tcBorders>
+              <w:top w:val="single" w:sz="6" w:space="0" w:color="C4C7C5"/>
+              <w:left w:val="single" w:sz="6" w:space="0" w:color="C4C7C5"/>
+              <w:bottom w:val="single" w:sz="6" w:space="0" w:color="C4C7C5"/>
+              <w:right w:val="single" w:sz="6" w:space="0" w:color="C4C7C5"/>
+            </w:tcBorders>
+            <w:tcMar>
+              <w:top w:w="120" w:type="dxa"/>
+              <w:left w:w="180" w:type="dxa"/>
+              <w:bottom w:w="120" w:type="dxa"/>
+              <w:right w:w="180" w:type="dxa"/>
+            </w:tcMar>
+            <w:vAlign w:val="center"/>
+            <w:hideMark/>
+          </w:tcPr>
+          <w:p>
+            <w:pPr>
+              <w:jc w:val="both"/>
+            </w:pPr>
+            <w:r>
+              <w:t>Moyen de paiement (</w:t>
+            </w:r>
+            <w:proofErr w:type="spellStart"/>
+            <w:r>
+              <w:t>moyen_paiement</w:t>
+            </w:r>
+            <w:proofErr w:type="spellEnd"/>
+            <w:r>
+              <w:t xml:space="preserve">) </w:t>
+            </w:r>
+          </w:p>
+        </w:tc>
+        <w:tc>
+          <w:tcPr>
+            <w:tcW w:w="0" w:type="auto"/>
+            <w:tcBorders>
+              <w:top w:val="single" w:sz="6" w:space="0" w:color="C4C7C5"/>
+              <w:left w:val="single" w:sz="6" w:space="0" w:color="C4C7C5"/>
+              <w:bottom w:val="single" w:sz="6" w:space="0" w:color="C4C7C5"/>
+              <w:right w:val="single" w:sz="6" w:space="0" w:color="C4C7C5"/>
+            </w:tcBorders>
+            <w:tcMar>
+              <w:top w:w="120" w:type="dxa"/>
+              <w:left w:w="180" w:type="dxa"/>
+              <w:bottom w:w="120" w:type="dxa"/>
+              <w:right w:w="180" w:type="dxa"/>
+            </w:tcMar>
+            <w:vAlign w:val="center"/>
+            <w:hideMark/>
+          </w:tcPr>
+          <w:p>
+            <w:pPr>
+              <w:jc w:val="both"/>
+            </w:pPr>
+            <w:r>
+              <w:t>Alphabétique / Chaîne</w:t>
+            </w:r>
+          </w:p>
+        </w:tc>
+        <w:tc>
+          <w:tcPr>
+            <w:tcW w:w="0" w:type="auto"/>
+            <w:tcBorders>
+              <w:top w:val="single" w:sz="6" w:space="0" w:color="C4C7C5"/>
+              <w:left w:val="single" w:sz="6" w:space="0" w:color="C4C7C5"/>
+              <w:bottom w:val="single" w:sz="6" w:space="0" w:color="C4C7C5"/>
+              <w:right w:val="single" w:sz="6" w:space="0" w:color="C4C7C5"/>
+            </w:tcBorders>
+            <w:tcMar>
+              <w:top w:w="120" w:type="dxa"/>
+              <w:left w:w="180" w:type="dxa"/>
+              <w:bottom w:w="120" w:type="dxa"/>
+              <w:right w:w="180" w:type="dxa"/>
+            </w:tcMar>
+            <w:vAlign w:val="center"/>
+            <w:hideMark/>
+          </w:tcPr>
+          <w:p>
+            <w:pPr>
+              <w:jc w:val="both"/>
+            </w:pPr>
+            <w:r>
+              <w:t>20 caractères</w:t>
+            </w:r>
+          </w:p>
+        </w:tc>
+      </w:tr>
+      <w:tr>
+        <w:trPr>
+          <w:tblCellSpacing w:w="15" w:type="dxa"/>
+        </w:trPr>
+        <w:tc>
+          <w:tcPr>
+            <w:tcW w:w="0" w:type="auto"/>
+            <w:tcBorders>
+              <w:top w:val="single" w:sz="6" w:space="0" w:color="C4C7C5"/>
+              <w:left w:val="single" w:sz="6" w:space="0" w:color="C4C7C5"/>
+              <w:bottom w:val="single" w:sz="6" w:space="0" w:color="C4C7C5"/>
+              <w:right w:val="single" w:sz="6" w:space="0" w:color="C4C7C5"/>
+            </w:tcBorders>
+            <w:tcMar>
+              <w:top w:w="120" w:type="dxa"/>
+              <w:left w:w="180" w:type="dxa"/>
+              <w:bottom w:w="120" w:type="dxa"/>
+              <w:right w:w="180" w:type="dxa"/>
+            </w:tcMar>
+            <w:vAlign w:val="center"/>
+            <w:hideMark/>
+          </w:tcPr>
+          <w:p>
+            <w:pPr>
+              <w:jc w:val="both"/>
+            </w:pPr>
+            <w:r>
+              <w:t>Identifiant unique du signalement (</w:t>
+            </w:r>
+            <w:proofErr w:type="spellStart"/>
+            <w:r>
+              <w:t>id_signalement</w:t>
+            </w:r>
+            <w:proofErr w:type="spellEnd"/>
+            <w:r>
+              <w:t xml:space="preserve">) </w:t>
+            </w:r>
+          </w:p>
+        </w:tc>
+        <w:tc>
+          <w:tcPr>
+            <w:tcW w:w="0" w:type="auto"/>
+            <w:tcBorders>
+              <w:top w:val="single" w:sz="6" w:space="0" w:color="C4C7C5"/>
+              <w:left w:val="single" w:sz="6" w:space="0" w:color="C4C7C5"/>
+              <w:bottom w:val="single" w:sz="6" w:space="0" w:color="C4C7C5"/>
+              <w:right w:val="single" w:sz="6" w:space="0" w:color="C4C7C5"/>
+            </w:tcBorders>
+            <w:tcMar>
+              <w:top w:w="120" w:type="dxa"/>
+              <w:left w:w="180" w:type="dxa"/>
+              <w:bottom w:w="120" w:type="dxa"/>
+              <w:right w:w="180" w:type="dxa"/>
+            </w:tcMar>
+            <w:vAlign w:val="center"/>
+            <w:hideMark/>
+          </w:tcPr>
+          <w:p>
+            <w:pPr>
+              <w:jc w:val="both"/>
+            </w:pPr>
+            <w:r>
+              <w:t>Numérique / Entier</w:t>
+            </w:r>
+          </w:p>
+        </w:tc>
+        <w:tc>
+          <w:tcPr>
+            <w:tcW w:w="0" w:type="auto"/>
+            <w:tcBorders>
+              <w:top w:val="single" w:sz="6" w:space="0" w:color="C4C7C5"/>
+              <w:left w:val="single" w:sz="6" w:space="0" w:color="C4C7C5"/>
+              <w:bottom w:val="single" w:sz="6" w:space="0" w:color="C4C7C5"/>
+              <w:right w:val="single" w:sz="6" w:space="0" w:color="C4C7C5"/>
+            </w:tcBorders>
+            <w:tcMar>
+              <w:top w:w="120" w:type="dxa"/>
+              <w:left w:w="180" w:type="dxa"/>
+              <w:bottom w:w="120" w:type="dxa"/>
+              <w:right w:w="180" w:type="dxa"/>
+            </w:tcMar>
+            <w:vAlign w:val="center"/>
+            <w:hideMark/>
+          </w:tcPr>
+          <w:p>
+            <w:pPr>
+              <w:jc w:val="both"/>
+            </w:pPr>
+            <w:r>
+              <w:t>8 chiffres</w:t>
+            </w:r>
+          </w:p>
+        </w:tc>
+      </w:tr>
+      <w:tr>
+        <w:trPr>
+          <w:tblCellSpacing w:w="15" w:type="dxa"/>
+        </w:trPr>
+        <w:tc>
+          <w:tcPr>
+            <w:tcW w:w="0" w:type="auto"/>
+            <w:tcBorders>
+              <w:top w:val="single" w:sz="6" w:space="0" w:color="C4C7C5"/>
+              <w:left w:val="single" w:sz="6" w:space="0" w:color="C4C7C5"/>
+              <w:bottom w:val="single" w:sz="6" w:space="0" w:color="C4C7C5"/>
+              <w:right w:val="single" w:sz="6" w:space="0" w:color="C4C7C5"/>
+            </w:tcBorders>
+            <w:tcMar>
+              <w:top w:w="120" w:type="dxa"/>
+              <w:left w:w="180" w:type="dxa"/>
+              <w:bottom w:w="120" w:type="dxa"/>
+              <w:right w:w="180" w:type="dxa"/>
+            </w:tcMar>
+            <w:vAlign w:val="center"/>
+            <w:hideMark/>
+          </w:tcPr>
+          <w:p>
+            <w:pPr>
+              <w:jc w:val="both"/>
+            </w:pPr>
+            <w:r>
+              <w:t>Motif du signalement (</w:t>
+            </w:r>
+            <w:proofErr w:type="spellStart"/>
+            <w:r>
+              <w:t>motif_signalement</w:t>
+            </w:r>
+            <w:proofErr w:type="spellEnd"/>
+            <w:r>
+              <w:t xml:space="preserve">) </w:t>
+            </w:r>
+          </w:p>
+        </w:tc>
+        <w:tc>
+          <w:tcPr>
+            <w:tcW w:w="0" w:type="auto"/>
+            <w:tcBorders>
+              <w:top w:val="single" w:sz="6" w:space="0" w:color="C4C7C5"/>
+              <w:left w:val="single" w:sz="6" w:space="0" w:color="C4C7C5"/>
+              <w:bottom w:val="single" w:sz="6" w:space="0" w:color="C4C7C5"/>
+              <w:right w:val="single" w:sz="6" w:space="0" w:color="C4C7C5"/>
+            </w:tcBorders>
+            <w:tcMar>
+              <w:top w:w="120" w:type="dxa"/>
+              <w:left w:w="180" w:type="dxa"/>
+              <w:bottom w:w="120" w:type="dxa"/>
+              <w:right w:w="180" w:type="dxa"/>
+            </w:tcMar>
+            <w:vAlign w:val="center"/>
+            <w:hideMark/>
+          </w:tcPr>
+          <w:p>
+            <w:pPr>
+              <w:jc w:val="both"/>
+            </w:pPr>
+            <w:proofErr w:type="spellStart"/>
+            <w:r>
+              <w:t>Alpha-numérique</w:t>
+            </w:r>
+            <w:proofErr w:type="spellEnd"/>
+            <w:r>
+              <w:t xml:space="preserve"> / Chaîne</w:t>
+            </w:r>
+          </w:p>
+        </w:tc>
+        <w:tc>
+          <w:tcPr>
+            <w:tcW w:w="0" w:type="auto"/>
+            <w:tcBorders>
+              <w:top w:val="single" w:sz="6" w:space="0" w:color="C4C7C5"/>
+              <w:left w:val="single" w:sz="6" w:space="0" w:color="C4C7C5"/>
+              <w:bottom w:val="single" w:sz="6" w:space="0" w:color="C4C7C5"/>
+              <w:right w:val="single" w:sz="6" w:space="0" w:color="C4C7C5"/>
+            </w:tcBorders>
+            <w:tcMar>
+              <w:top w:w="120" w:type="dxa"/>
+              <w:left w:w="180" w:type="dxa"/>
+              <w:bottom w:w="120" w:type="dxa"/>
+              <w:right w:w="180" w:type="dxa"/>
+            </w:tcMar>
+            <w:vAlign w:val="center"/>
+            <w:hideMark/>
+          </w:tcPr>
+          <w:p>
+            <w:pPr>
+              <w:jc w:val="both"/>
+            </w:pPr>
+            <w:r>
+              <w:t>100 caractères</w:t>
+            </w:r>
+          </w:p>
+        </w:tc>
+      </w:tr>
+      <w:tr>
+        <w:trPr>
+          <w:tblCellSpacing w:w="15" w:type="dxa"/>
+        </w:trPr>
+        <w:tc>
+          <w:tcPr>
+            <w:tcW w:w="0" w:type="auto"/>
+            <w:tcBorders>
+              <w:top w:val="single" w:sz="6" w:space="0" w:color="C4C7C5"/>
+              <w:left w:val="single" w:sz="6" w:space="0" w:color="C4C7C5"/>
+              <w:bottom w:val="single" w:sz="6" w:space="0" w:color="C4C7C5"/>
+              <w:right w:val="single" w:sz="6" w:space="0" w:color="C4C7C5"/>
+            </w:tcBorders>
+            <w:tcMar>
+              <w:top w:w="120" w:type="dxa"/>
+              <w:left w:w="180" w:type="dxa"/>
+              <w:bottom w:w="120" w:type="dxa"/>
+              <w:right w:w="180" w:type="dxa"/>
+            </w:tcMar>
+            <w:vAlign w:val="center"/>
+            <w:hideMark/>
+          </w:tcPr>
+          <w:p>
+            <w:pPr>
+              <w:jc w:val="both"/>
+            </w:pPr>
+            <w:r>
+              <w:t>Décision de modération (</w:t>
+            </w:r>
+            <w:proofErr w:type="spellStart"/>
+            <w:r>
+              <w:t>decision_moderation</w:t>
+            </w:r>
+            <w:proofErr w:type="spellEnd"/>
+            <w:r>
+              <w:t xml:space="preserve">) </w:t>
+            </w:r>
+          </w:p>
+        </w:tc>
+        <w:tc>
+          <w:tcPr>
+            <w:tcW w:w="0" w:type="auto"/>
+            <w:tcBorders>
+              <w:top w:val="single" w:sz="6" w:space="0" w:color="C4C7C5"/>
+              <w:left w:val="single" w:sz="6" w:space="0" w:color="C4C7C5"/>
+              <w:bottom w:val="single" w:sz="6" w:space="0" w:color="C4C7C5"/>
+              <w:right w:val="single" w:sz="6" w:space="0" w:color="C4C7C5"/>
+            </w:tcBorders>
+            <w:tcMar>
+              <w:top w:w="120" w:type="dxa"/>
+              <w:left w:w="180" w:type="dxa"/>
+              <w:bottom w:w="120" w:type="dxa"/>
+              <w:right w:w="180" w:type="dxa"/>
+            </w:tcMar>
+            <w:vAlign w:val="center"/>
+            <w:hideMark/>
+          </w:tcPr>
+          <w:p>
+            <w:pPr>
+              <w:jc w:val="both"/>
+            </w:pPr>
+            <w:proofErr w:type="spellStart"/>
+            <w:r>
+              <w:t>Alpha-numérique</w:t>
+            </w:r>
+            <w:proofErr w:type="spellEnd"/>
+            <w:r>
+              <w:t xml:space="preserve"> / Chaîne</w:t>
+            </w:r>
+          </w:p>
+        </w:tc>
+        <w:tc>
+          <w:tcPr>
+            <w:tcW w:w="0" w:type="auto"/>
+            <w:tcBorders>
+              <w:top w:val="single" w:sz="6" w:space="0" w:color="C4C7C5"/>
+              <w:left w:val="single" w:sz="6" w:space="0" w:color="C4C7C5"/>
+              <w:bottom w:val="single" w:sz="6" w:space="0" w:color="C4C7C5"/>
+              <w:right w:val="single" w:sz="6" w:space="0" w:color="C4C7C5"/>
+            </w:tcBorders>
+            <w:tcMar>
+              <w:top w:w="120" w:type="dxa"/>
+              <w:left w:w="180" w:type="dxa"/>
+              <w:bottom w:w="120" w:type="dxa"/>
+              <w:right w:w="180" w:type="dxa"/>
+            </w:tcMar>
+            <w:vAlign w:val="center"/>
+            <w:hideMark/>
+          </w:tcPr>
+          <w:p>
+            <w:pPr>
+              <w:jc w:val="both"/>
+            </w:pPr>
+            <w:r>
+              <w:t>100 caractères</w:t>
+            </w:r>
+          </w:p>
+        </w:tc>
+      </w:tr>
+    </w:tbl>
+    <w:p>
+      <w:pPr>
+        <w:jc w:val="both"/>
+      </w:pPr>
     </w:p>
     <w:sectPr>
       <w:pgSz w:w="11906" w:h="16838"/>
@@ -286,6 +4036,163 @@
     </w:sectPr>
   </w:body>
 </w:document>
+</file>
+
+<file path=word/numbering.xml><?xml version="1.0" encoding="utf-8"?>
+<w:numbering xmlns:wpc="http://schemas.microsoft.com/office/word/2010/wordprocessingCanvas" xmlns:cx="http://schemas.microsoft.com/office/drawing/2014/chartex" xmlns:cx1="http://schemas.microsoft.com/office/drawing/2015/9/8/chartex" xmlns:cx2="http://schemas.microsoft.com/office/drawing/2015/10/21/chartex" xmlns:cx3="http://schemas.microsoft.com/office/drawing/2016/5/9/chartex" xmlns:cx4="http://schemas.microsoft.com/office/drawing/2016/5/10/chartex" xmlns:cx5="http://schemas.microsoft.com/office/drawing/2016/5/11/chartex" xmlns:cx6="http://schemas.microsoft.com/office/drawing/2016/5/12/chartex" xmlns:cx7="http://schemas.microsoft.com/office/drawing/2016/5/13/chartex" xmlns:cx8="http://schemas.microsoft.com/office/drawing/2016/5/14/chartex" xmlns:mc="http://schemas.openxmlformats.org/markup-compatibility/2006" xmlns:aink="http://schemas.microsoft.com/office/drawing/2016/ink" xmlns:am3d="http://schemas.microsoft.com/office/drawing/2017/model3d" xmlns:o="urn:schemas-microsoft-com:office:office" xmlns:oel="http://schemas.microsoft.com/office/2019/extlst" xmlns:r="http://schemas.openxmlformats.org/officeDocument/2006/relationships" xmlns:m="http://schemas.openxmlformats.org/officeDocument/2006/math" xmlns:v="urn:schemas-microsoft-com:vml" xmlns:wp14="http://schemas.microsoft.com/office/word/2010/wordprocessingDrawing" xmlns:wp="http://schemas.openxmlformats.org/drawingml/2006/wordprocessingDrawing" xmlns:w10="urn:schemas-microsoft-com:office:word" xmlns:w="http://schemas.openxmlformats.org/wordprocessingml/2006/main" xmlns:w14="http://schemas.microsoft.com/office/word/2010/wordml" xmlns:w15="http://schemas.microsoft.com/office/word/2012/wordml" xmlns:w16cex="http://schemas.microsoft.com/office/word/2018/wordml/cex" xmlns:w16cid="http://schemas.microsoft.com/office/word/2016/wordml/cid" xmlns:w16="http://schemas.microsoft.com/office/word/2018/wordml" xmlns:w16du="http://schemas.microsoft.com/office/word/2023/wordml/word16du" xmlns:w16sdtdh="http://schemas.microsoft.com/office/word/2020/wordml/sdtdatahash" xmlns:w16sdtfl="http://schemas.microsoft.com/office/word/2024/wordml/sdtformatlock" xmlns:w16se="http://schemas.microsoft.com/office/word/2015/wordml/symex" xmlns:wpg="http://schemas.microsoft.com/office/word/2010/wordprocessingGroup" xmlns:wpi="http://schemas.microsoft.com/office/word/2010/wordprocessingInk" xmlns:wne="http://schemas.microsoft.com/office/word/2006/wordml" xmlns:wps="http://schemas.microsoft.com/office/word/2010/wordprocessingShape" mc:Ignorable="w14 w15 w16se w16cid w16 w16cex w16sdtdh w16sdtfl w16du wp14">
+  <w:abstractNum w:abstractNumId="0" w15:restartNumberingAfterBreak="0">
+    <w:nsid w:val="43AC4F3F"/>
+    <w:multiLevelType w:val="multilevel"/>
+    <w:tmpl w:val="AD9244C4"/>
+    <w:lvl w:ilvl="0">
+      <w:start w:val="1"/>
+      <w:numFmt w:val="bullet"/>
+      <w:lvlText w:val=""/>
+      <w:lvlJc w:val="left"/>
+      <w:pPr>
+        <w:tabs>
+          <w:tab w:val="num" w:pos="720"/>
+        </w:tabs>
+        <w:ind w:left="720" w:hanging="360"/>
+      </w:pPr>
+      <w:rPr>
+        <w:rFonts w:ascii="Symbol" w:hAnsi="Symbol" w:hint="default"/>
+        <w:sz w:val="20"/>
+      </w:rPr>
+    </w:lvl>
+    <w:lvl w:ilvl="1" w:tentative="1">
+      <w:start w:val="1"/>
+      <w:numFmt w:val="bullet"/>
+      <w:lvlText w:val="o"/>
+      <w:lvlJc w:val="left"/>
+      <w:pPr>
+        <w:tabs>
+          <w:tab w:val="num" w:pos="1440"/>
+        </w:tabs>
+        <w:ind w:left="1440" w:hanging="360"/>
+      </w:pPr>
+      <w:rPr>
+        <w:rFonts w:ascii="Courier New" w:hAnsi="Courier New" w:hint="default"/>
+        <w:sz w:val="20"/>
+      </w:rPr>
+    </w:lvl>
+    <w:lvl w:ilvl="2" w:tentative="1">
+      <w:start w:val="1"/>
+      <w:numFmt w:val="bullet"/>
+      <w:lvlText w:val=""/>
+      <w:lvlJc w:val="left"/>
+      <w:pPr>
+        <w:tabs>
+          <w:tab w:val="num" w:pos="2160"/>
+        </w:tabs>
+        <w:ind w:left="2160" w:hanging="360"/>
+      </w:pPr>
+      <w:rPr>
+        <w:rFonts w:ascii="Wingdings" w:hAnsi="Wingdings" w:hint="default"/>
+        <w:sz w:val="20"/>
+      </w:rPr>
+    </w:lvl>
+    <w:lvl w:ilvl="3" w:tentative="1">
+      <w:start w:val="1"/>
+      <w:numFmt w:val="bullet"/>
+      <w:lvlText w:val=""/>
+      <w:lvlJc w:val="left"/>
+      <w:pPr>
+        <w:tabs>
+          <w:tab w:val="num" w:pos="2880"/>
+        </w:tabs>
+        <w:ind w:left="2880" w:hanging="360"/>
+      </w:pPr>
+      <w:rPr>
+        <w:rFonts w:ascii="Wingdings" w:hAnsi="Wingdings" w:hint="default"/>
+        <w:sz w:val="20"/>
+      </w:rPr>
+    </w:lvl>
+    <w:lvl w:ilvl="4" w:tentative="1">
+      <w:start w:val="1"/>
+      <w:numFmt w:val="bullet"/>
+      <w:lvlText w:val=""/>
+      <w:lvlJc w:val="left"/>
+      <w:pPr>
+        <w:tabs>
+          <w:tab w:val="num" w:pos="3600"/>
+        </w:tabs>
+        <w:ind w:left="3600" w:hanging="360"/>
+      </w:pPr>
+      <w:rPr>
+        <w:rFonts w:ascii="Wingdings" w:hAnsi="Wingdings" w:hint="default"/>
+        <w:sz w:val="20"/>
+      </w:rPr>
+    </w:lvl>
+    <w:lvl w:ilvl="5" w:tentative="1">
+      <w:start w:val="1"/>
+      <w:numFmt w:val="bullet"/>
+      <w:lvlText w:val=""/>
+      <w:lvlJc w:val="left"/>
+      <w:pPr>
+        <w:tabs>
+          <w:tab w:val="num" w:pos="4320"/>
+        </w:tabs>
+        <w:ind w:left="4320" w:hanging="360"/>
+      </w:pPr>
+      <w:rPr>
+        <w:rFonts w:ascii="Wingdings" w:hAnsi="Wingdings" w:hint="default"/>
+        <w:sz w:val="20"/>
+      </w:rPr>
+    </w:lvl>
+    <w:lvl w:ilvl="6" w:tentative="1">
+      <w:start w:val="1"/>
+      <w:numFmt w:val="bullet"/>
+      <w:lvlText w:val=""/>
+      <w:lvlJc w:val="left"/>
+      <w:pPr>
+        <w:tabs>
+          <w:tab w:val="num" w:pos="5040"/>
+        </w:tabs>
+        <w:ind w:left="5040" w:hanging="360"/>
+      </w:pPr>
+      <w:rPr>
+        <w:rFonts w:ascii="Wingdings" w:hAnsi="Wingdings" w:hint="default"/>
+        <w:sz w:val="20"/>
+      </w:rPr>
+    </w:lvl>
+    <w:lvl w:ilvl="7" w:tentative="1">
+      <w:start w:val="1"/>
+      <w:numFmt w:val="bullet"/>
+      <w:lvlText w:val=""/>
+      <w:lvlJc w:val="left"/>
+      <w:pPr>
+        <w:tabs>
+          <w:tab w:val="num" w:pos="5760"/>
+        </w:tabs>
+        <w:ind w:left="5760" w:hanging="360"/>
+      </w:pPr>
+      <w:rPr>
+        <w:rFonts w:ascii="Wingdings" w:hAnsi="Wingdings" w:hint="default"/>
+        <w:sz w:val="20"/>
+      </w:rPr>
+    </w:lvl>
+    <w:lvl w:ilvl="8" w:tentative="1">
+      <w:start w:val="1"/>
+      <w:numFmt w:val="bullet"/>
+      <w:lvlText w:val=""/>
+      <w:lvlJc w:val="left"/>
+      <w:pPr>
+        <w:tabs>
+          <w:tab w:val="num" w:pos="6480"/>
+        </w:tabs>
+        <w:ind w:left="6480" w:hanging="360"/>
+      </w:pPr>
+      <w:rPr>
+        <w:rFonts w:ascii="Wingdings" w:hAnsi="Wingdings" w:hint="default"/>
+        <w:sz w:val="20"/>
+      </w:rPr>
+    </w:lvl>
+  </w:abstractNum>
+  <w:num w:numId="1" w16cid:durableId="1022124818">
+    <w:abstractNumId w:val="0"/>
+  </w:num>
+</w:numbering>
 </file>
 
 <file path=word/styles.xml><?xml version="1.0" encoding="utf-8"?>
@@ -891,7 +4798,6 @@
   <w:style w:type="character" w:default="1" w:styleId="Policepardfaut">
     <w:name w:val="Default Paragraph Font"/>
     <w:uiPriority w:val="1"/>
-    <w:semiHidden/>
     <w:unhideWhenUsed/>
   </w:style>
   <w:style w:type="table" w:default="1" w:styleId="TableauNormal">

</xml_diff>